<commit_message>
update to data analysis doc
</commit_message>
<xml_diff>
--- a/docs/Data Analysis.docx
+++ b/docs/Data Analysis.docx
@@ -22,46 +22,113 @@
       </w:r>
     </w:p>
     <w:p>
+      <w:pPr>
+        <w:rPr>
+          <w:moveTo w:id="0" w:author="Lima, Nathan M. (Fed)" w:date="2026-02-18T11:10:00Z" w16du:dateUtc="2026-02-18T16:10:00Z"/>
+        </w:rPr>
+      </w:pPr>
+      <w:moveToRangeStart w:id="1" w:author="Lima, Nathan M. (Fed)" w:date="2026-02-18T11:10:00Z" w:name="move222305443"/>
+      <w:moveTo w:id="2" w:author="Lima, Nathan M. (Fed)" w:date="2026-02-18T11:10:00Z" w16du:dateUtc="2026-02-18T16:10:00Z">
+        <w:r>
+          <w:t>I:\EPA Shower\</w:t>
+        </w:r>
+        <w:proofErr w:type="spellStart"/>
+        <w:r>
+          <w:t>Aerotrak</w:t>
+        </w:r>
+        <w:proofErr w:type="spellEnd"/>
+        <w:r>
+          <w:t xml:space="preserve"> (not used at present)</w:t>
+        </w:r>
+      </w:moveTo>
+    </w:p>
+    <w:moveToRangeEnd w:id="1"/>
+    <w:p>
+      <w:pPr>
+        <w:rPr>
+          <w:ins w:id="3" w:author="Lima, Nathan M. (Fed)" w:date="2026-02-18T11:10:00Z" w16du:dateUtc="2026-02-18T16:10:00Z"/>
+        </w:rPr>
+      </w:pPr>
       <w:r>
         <w:t>I:\EPA Shower\CO2</w:t>
       </w:r>
     </w:p>
     <w:p>
-      <w:r>
-        <w:t>I:\EPA Shower\</w:t>
-      </w:r>
-      <w:proofErr w:type="spellStart"/>
-      <w:r>
-        <w:t>Aerotrak</w:t>
-      </w:r>
-      <w:proofErr w:type="spellEnd"/>
-      <w:r>
-        <w:t xml:space="preserve"> (not used at present)</w:t>
-      </w:r>
+      <w:pPr>
+        <w:rPr>
+          <w:ins w:id="4" w:author="Lima, Nathan M. (Fed)" w:date="2026-02-18T11:10:00Z" w16du:dateUtc="2026-02-18T16:10:00Z"/>
+        </w:rPr>
+      </w:pPr>
+      <w:ins w:id="5" w:author="Lima, Nathan M. (Fed)" w:date="2026-02-18T11:10:00Z" w16du:dateUtc="2026-02-18T16:10:00Z">
+        <w:r>
+          <w:t>I:\EPA Shower\</w:t>
+        </w:r>
+        <w:r>
+          <w:t>HOBOs</w:t>
+        </w:r>
+      </w:ins>
     </w:p>
     <w:p>
-      <w:r>
-        <w:t>I:\EPA Shower\MH DAQ</w:t>
-      </w:r>
-      <w:r>
-        <w:t>\</w:t>
-      </w:r>
-      <w:proofErr w:type="spellStart"/>
-      <w:r>
-        <w:t>indoor_daq</w:t>
-      </w:r>
-      <w:proofErr w:type="spellEnd"/>
-      <w:r>
-        <w:t>\2026</w:t>
-      </w:r>
+      <w:pPr>
+        <w:rPr>
+          <w:moveTo w:id="6" w:author="Lima, Nathan M. (Fed)" w:date="2026-02-18T11:10:00Z" w16du:dateUtc="2026-02-18T16:10:00Z"/>
+        </w:rPr>
+      </w:pPr>
+      <w:moveToRangeStart w:id="7" w:author="Lima, Nathan M. (Fed)" w:date="2026-02-18T11:10:00Z" w:name="move222305470"/>
+      <w:moveTo w:id="8" w:author="Lima, Nathan M. (Fed)" w:date="2026-02-18T11:10:00Z" w16du:dateUtc="2026-02-18T16:10:00Z">
+        <w:r>
+          <w:t>I:\EPA Shower\</w:t>
+        </w:r>
+        <w:r>
+          <w:t>Log - CO2 Injection</w:t>
+        </w:r>
+      </w:moveTo>
     </w:p>
     <w:p>
-      <w:r>
-        <w:t>I:\EPA Shower\MH DAQ\</w:t>
+      <w:pPr>
+        <w:rPr>
+          <w:del w:id="9" w:author="Lima, Nathan M. (Fed)" w:date="2026-02-18T11:10:00Z" w16du:dateUtc="2026-02-18T16:10:00Z"/>
+          <w:moveTo w:id="10" w:author="Lima, Nathan M. (Fed)" w:date="2026-02-18T11:10:00Z" w16du:dateUtc="2026-02-18T16:10:00Z"/>
+        </w:rPr>
+      </w:pPr>
+      <w:moveTo w:id="11" w:author="Lima, Nathan M. (Fed)" w:date="2026-02-18T11:10:00Z" w16du:dateUtc="2026-02-18T16:10:00Z">
+        <w:r>
+          <w:t>I:\EPA Shower\</w:t>
+        </w:r>
+        <w:r>
+          <w:t>Log - Shower</w:t>
+        </w:r>
+      </w:moveTo>
+    </w:p>
+    <w:moveToRangeEnd w:id="7"/>
+    <w:p/>
+    <w:p>
+      <w:pPr>
+        <w:rPr>
+          <w:moveFrom w:id="12" w:author="Lima, Nathan M. (Fed)" w:date="2026-02-18T11:10:00Z" w16du:dateUtc="2026-02-18T16:10:00Z"/>
+        </w:rPr>
+      </w:pPr>
+      <w:moveFromRangeStart w:id="13" w:author="Lima, Nathan M. (Fed)" w:date="2026-02-18T11:10:00Z" w:name="move222305443"/>
+      <w:moveFrom w:id="14" w:author="Lima, Nathan M. (Fed)" w:date="2026-02-18T11:10:00Z" w16du:dateUtc="2026-02-18T16:10:00Z">
+        <w:r>
+          <w:t>I:\EPA Shower\Aerotrak</w:t>
+        </w:r>
+        <w:r>
+          <w:t xml:space="preserve"> (not used at present)</w:t>
+        </w:r>
+      </w:moveFrom>
+    </w:p>
+    <w:moveFromRangeEnd w:id="13"/>
+    <w:p>
+      <w:r>
+        <w:t>I:\EPA Shower\MH DAQ</w:t>
+      </w:r>
+      <w:r>
+        <w:t>\</w:t>
       </w:r>
       <w:proofErr w:type="spellStart"/>
       <w:r>
-        <w:t>weather_station</w:t>
+        <w:t>indoor_daq</w:t>
       </w:r>
       <w:proofErr w:type="spellEnd"/>
       <w:r>
@@ -70,51 +137,100 @@
     </w:p>
     <w:p>
       <w:r>
-        <w:t>I:\EPA Shower\</w:t>
+        <w:t>I:\EPA Shower\MH DAQ\</w:t>
       </w:r>
       <w:proofErr w:type="spellStart"/>
       <w:r>
-        <w:t>QuantAQ</w:t>
+        <w:t>weather_station</w:t>
       </w:r>
       <w:proofErr w:type="spellEnd"/>
+      <w:r>
+        <w:t>\2026</w:t>
+      </w:r>
     </w:p>
     <w:p>
-      <w:r>
-        <w:t>I:\EPA Shower\</w:t>
-      </w:r>
-      <w:r>
-        <w:t>Log - CO2 Injection</w:t>
+      <w:pPr>
+        <w:rPr>
+          <w:ins w:id="15" w:author="Lima, Nathan M. (Fed)" w:date="2026-02-18T11:11:00Z" w16du:dateUtc="2026-02-18T16:11:00Z"/>
+        </w:rPr>
+      </w:pPr>
+      <w:r>
+        <w:t>I:\EPA Shower\QuantAQ</w:t>
       </w:r>
     </w:p>
     <w:p>
-      <w:r>
-        <w:t>I:\EPA Shower\</w:t>
-      </w:r>
-      <w:r>
-        <w:t>Log - Shower</w:t>
-      </w:r>
+      <w:pPr>
+        <w:rPr>
+          <w:ins w:id="16" w:author="Lima, Nathan M. (Fed)" w:date="2026-02-18T11:11:00Z" w16du:dateUtc="2026-02-18T16:11:00Z"/>
+        </w:rPr>
+      </w:pPr>
+      <w:ins w:id="17" w:author="Lima, Nathan M. (Fed)" w:date="2026-02-18T11:11:00Z" w16du:dateUtc="2026-02-18T16:11:00Z">
+        <w:r>
+          <w:t>I:\EPA Shower\</w:t>
+        </w:r>
+        <w:r>
+          <w:t xml:space="preserve">Water Flows and </w:t>
+        </w:r>
+        <w:proofErr w:type="gramStart"/>
+        <w:r>
+          <w:t>Temps</w:t>
+        </w:r>
+        <w:proofErr w:type="gramEnd"/>
+      </w:ins>
     </w:p>
     <w:p>
       <w:pPr>
-        <w:pStyle w:val="Heading1"/>
-      </w:pPr>
-      <w:r>
-        <w:t>CO</w:t>
-      </w:r>
-      <w:r>
-        <w:rPr>
-          <w:vertAlign w:val="subscript"/>
-        </w:rPr>
-        <w:t>2</w:t>
-      </w:r>
-      <w:r>
-        <w:t xml:space="preserve"> Analysis:</w:t>
-      </w:r>
+        <w:rPr>
+          <w:moveFrom w:id="18" w:author="Lima, Nathan M. (Fed)" w:date="2026-02-18T11:10:00Z" w16du:dateUtc="2026-02-18T16:10:00Z"/>
+        </w:rPr>
+      </w:pPr>
+      <w:moveFromRangeStart w:id="19" w:author="Lima, Nathan M. (Fed)" w:date="2026-02-18T11:10:00Z" w:name="move222305470"/>
+      <w:moveFrom w:id="20" w:author="Lima, Nathan M. (Fed)" w:date="2026-02-18T11:10:00Z" w16du:dateUtc="2026-02-18T16:10:00Z">
+        <w:r>
+          <w:t>I:\EPA Shower\</w:t>
+        </w:r>
+        <w:r>
+          <w:t>Log - CO2 Injection</w:t>
+        </w:r>
+      </w:moveFrom>
     </w:p>
     <w:p>
       <w:pPr>
         <w:rPr>
-          <w:ins w:id="0" w:author="Lima, Nathan M. (Fed)" w:date="2026-02-17T12:10:00Z" w16du:dateUtc="2026-02-17T17:10:00Z"/>
+          <w:moveFrom w:id="21" w:author="Lima, Nathan M. (Fed)" w:date="2026-02-18T11:10:00Z" w16du:dateUtc="2026-02-18T16:10:00Z"/>
+        </w:rPr>
+      </w:pPr>
+      <w:moveFrom w:id="22" w:author="Lima, Nathan M. (Fed)" w:date="2026-02-18T11:10:00Z" w16du:dateUtc="2026-02-18T16:10:00Z">
+        <w:r>
+          <w:t>I:\EPA Shower\</w:t>
+        </w:r>
+        <w:r>
+          <w:t>Log - Shower</w:t>
+        </w:r>
+      </w:moveFrom>
+    </w:p>
+    <w:moveFromRangeEnd w:id="19"/>
+    <w:p>
+      <w:pPr>
+        <w:pStyle w:val="Heading1"/>
+      </w:pPr>
+      <w:r>
+        <w:t>CO</w:t>
+      </w:r>
+      <w:r>
+        <w:rPr>
+          <w:vertAlign w:val="subscript"/>
+        </w:rPr>
+        <w:t>2</w:t>
+      </w:r>
+      <w:r>
+        <w:t xml:space="preserve"> Analysis:</w:t>
+      </w:r>
+    </w:p>
+    <w:p>
+      <w:pPr>
+        <w:rPr>
+          <w:ins w:id="23" w:author="Lima, Nathan M. (Fed)" w:date="2026-02-17T12:10:00Z" w16du:dateUtc="2026-02-17T17:10:00Z"/>
         </w:rPr>
       </w:pPr>
       <w:r>
@@ -128,11 +244,9 @@
       <w:r>
         <w:t xml:space="preserve"> data files</w:t>
       </w:r>
-      <w:proofErr w:type="gramStart"/>
-      <w:r>
-        <w:t>:  Bedroom</w:t>
-      </w:r>
-      <w:proofErr w:type="gramEnd"/>
+      <w:r>
+        <w:t>: Bedroom</w:t>
+      </w:r>
       <w:r>
         <w:t>, Entry</w:t>
       </w:r>
@@ -154,12 +268,12 @@
           <w:i/>
           <w:iCs/>
           <w:color w:val="FF0000"/>
-          <w:rPrChange w:id="1" w:author="Lima, Nathan M. (Fed)" w:date="2026-02-17T12:10:00Z" w16du:dateUtc="2026-02-17T17:10:00Z">
+          <w:rPrChange w:id="24" w:author="Lima, Nathan M. (Fed)" w:date="2026-02-17T12:10:00Z" w16du:dateUtc="2026-02-17T17:10:00Z">
             <w:rPr/>
           </w:rPrChange>
         </w:rPr>
       </w:pPr>
-      <w:ins w:id="2" w:author="Lima, Nathan M. (Fed)" w:date="2026-02-17T12:10:00Z" w16du:dateUtc="2026-02-17T17:10:00Z">
+      <w:ins w:id="25" w:author="Lima, Nathan M. (Fed)" w:date="2026-02-17T12:10:00Z" w16du:dateUtc="2026-02-17T17:10:00Z">
         <w:r>
           <w:rPr>
             <w:b/>
@@ -167,7 +281,7 @@
             <w:i/>
             <w:iCs/>
             <w:color w:val="FF0000"/>
-            <w:rPrChange w:id="3" w:author="Lima, Nathan M. (Fed)" w:date="2026-02-17T12:10:00Z" w16du:dateUtc="2026-02-17T17:10:00Z">
+            <w:rPrChange w:id="26" w:author="Lima, Nathan M. (Fed)" w:date="2026-02-17T12:10:00Z" w16du:dateUtc="2026-02-17T17:10:00Z">
               <w:rPr>
                 <w:color w:val="FF0000"/>
               </w:rPr>
@@ -283,42 +397,66 @@
         <w:t>)</w:t>
       </w:r>
       <w:r>
-        <w:t xml:space="preserve">. Solve the purple equation for each time step. Then </w:t>
+        <w:t>. Solve the purple equation for each time step. Then</w:t>
+      </w:r>
+      <w:r>
+        <w:t>,</w:t>
+      </w:r>
+      <w:r>
+        <w:t xml:space="preserve"> </w:t>
       </w:r>
       <w:r>
         <w:t>c</w:t>
       </w:r>
       <w:r>
-        <w:t xml:space="preserve">alculate the average and standard deviation of the lambda for </w:t>
+        <w:t xml:space="preserve">alculate the average and standard deviation of </w:t>
+      </w:r>
+      <w:r>
+        <w:t>lambda over the</w:t>
+      </w:r>
+      <w:r>
+        <w:t xml:space="preserve"> </w:t>
+      </w:r>
+      <w:r>
+        <w:t>2</w:t>
+      </w:r>
+      <w:r>
+        <w:t xml:space="preserve"> hours after CO</w:t>
+      </w:r>
+      <w:r>
+        <w:rPr>
+          <w:vertAlign w:val="subscript"/>
+        </w:rPr>
+        <w:t>2</w:t>
+      </w:r>
+      <w:r>
+        <w:t xml:space="preserve"> injection.</w:t>
+      </w:r>
+      <w:r>
+        <w:t xml:space="preserve"> Start</w:t>
+      </w:r>
+      <w:r>
+        <w:t xml:space="preserve"> the</w:t>
+      </w:r>
+      <w:r>
+        <w:t xml:space="preserve"> decay calculation </w:t>
+      </w:r>
+      <w:r>
+        <w:t xml:space="preserve">10 minutes </w:t>
+      </w:r>
+      <w:r>
+        <w:t>before</w:t>
+      </w:r>
+      <w:r>
+        <w:t xml:space="preserve"> the top of the hour (CO2 </w:t>
       </w:r>
       <w:proofErr w:type="gramStart"/>
       <w:r>
-        <w:t>the 2</w:t>
+        <w:t>is injected</w:t>
       </w:r>
       <w:proofErr w:type="gramEnd"/>
       <w:r>
-        <w:t xml:space="preserve"> hours after CO</w:t>
-      </w:r>
-      <w:r>
-        <w:rPr>
-          <w:vertAlign w:val="subscript"/>
-        </w:rPr>
-        <w:t>2</w:t>
-      </w:r>
-      <w:r>
-        <w:t xml:space="preserve"> injection.</w:t>
-      </w:r>
-      <w:r>
-        <w:t xml:space="preserve"> Start</w:t>
-      </w:r>
-      <w:r>
-        <w:t xml:space="preserve"> the</w:t>
-      </w:r>
-      <w:r>
-        <w:t xml:space="preserve"> decay calculation </w:t>
-      </w:r>
-      <w:r>
-        <w:t xml:space="preserve">10 minutes prior to the top of the hour (CO2 is injected from </w:t>
+        <w:t xml:space="preserve"> from </w:t>
       </w:r>
       <w:r>
         <w:t>38</w:t>
@@ -834,6 +972,7 @@
               <w:rFonts w:ascii="Cambria Math" w:hAnsi="Cambria Math"/>
               <w:color w:val="000000" w:themeColor="text1"/>
             </w:rPr>
+            <w:lastRenderedPageBreak/>
             <m:t>V</m:t>
           </m:r>
           <m:f>
@@ -1003,7 +1142,6 @@
               <w:rFonts w:ascii="Cambria Math" w:hAnsi="Cambria Math"/>
               <w:color w:val="000000" w:themeColor="text1"/>
             </w:rPr>
-            <w:lastRenderedPageBreak/>
             <m:t>V</m:t>
           </m:r>
           <m:f>
@@ -1196,7 +1334,14 @@
               <w:rFonts w:ascii="Cambria Math"/>
               <w:color w:val="000000" w:themeColor="text1"/>
             </w:rPr>
-            <m:t>=λ</m:t>
+            <m:t>=</m:t>
+          </m:r>
+          <m:r>
+            <w:rPr>
+              <w:rFonts w:ascii="Cambria Math"/>
+              <w:color w:val="000000" w:themeColor="text1"/>
+            </w:rPr>
+            <m:t>λ</m:t>
           </m:r>
           <m:d>
             <m:dPr>
@@ -1234,7 +1379,35 @@
                       <w:rFonts w:ascii="Cambria Math"/>
                       <w:color w:val="000000" w:themeColor="text1"/>
                     </w:rPr>
-                    <m:t>average,Out&amp;Entry</m:t>
+                    <m:t>average</m:t>
+                  </m:r>
+                  <m:r>
+                    <w:rPr>
+                      <w:rFonts w:ascii="Cambria Math"/>
+                      <w:color w:val="000000" w:themeColor="text1"/>
+                    </w:rPr>
+                    <m:t>,</m:t>
+                  </m:r>
+                  <m:r>
+                    <w:rPr>
+                      <w:rFonts w:ascii="Cambria Math"/>
+                      <w:color w:val="000000" w:themeColor="text1"/>
+                    </w:rPr>
+                    <m:t>Out</m:t>
+                  </m:r>
+                  <m:r>
+                    <w:rPr>
+                      <w:rFonts w:ascii="Cambria Math"/>
+                      <w:color w:val="000000" w:themeColor="text1"/>
+                    </w:rPr>
+                    <m:t>&amp;</m:t>
+                  </m:r>
+                  <m:r>
+                    <w:rPr>
+                      <w:rFonts w:ascii="Cambria Math"/>
+                      <w:color w:val="000000" w:themeColor="text1"/>
+                    </w:rPr>
+                    <m:t>Entry</m:t>
                   </m:r>
                 </m:sub>
               </m:sSub>
@@ -1610,13 +1783,19 @@
           <w:rFonts w:eastAsiaTheme="minorEastAsia"/>
           <w:color w:val="000000" w:themeColor="text1"/>
         </w:rPr>
-        <w:t xml:space="preserve">is the value in the room at the start of the decay.   </w:t>
-      </w:r>
-      <w:r>
-        <w:rPr>
-          <w:rFonts w:eastAsiaTheme="minorEastAsia"/>
-        </w:rPr>
-        <w:t xml:space="preserve">An average of </w:t>
+        <w:t xml:space="preserve">is the value in the room at the start of the decay. </w:t>
+      </w:r>
+      <w:r>
+        <w:rPr>
+          <w:rFonts w:eastAsiaTheme="minorEastAsia"/>
+        </w:rPr>
+        <w:t>The</w:t>
+      </w:r>
+      <w:r>
+        <w:rPr>
+          <w:rFonts w:eastAsiaTheme="minorEastAsia"/>
+        </w:rPr>
+        <w:t xml:space="preserve"> average </w:t>
       </w:r>
       <w:r>
         <w:rPr>
@@ -1628,33 +1807,58 @@
         <w:rPr>
           <w:rFonts w:eastAsiaTheme="minorEastAsia"/>
         </w:rPr>
-        <w:t xml:space="preserve"> for each injection then can be determined via a linear interpolation with the left side as the y variable and t as the x variable.  </w:t>
+        <w:t xml:space="preserve"> for each injection can</w:t>
+      </w:r>
+      <w:r>
+        <w:rPr>
+          <w:rFonts w:eastAsiaTheme="minorEastAsia"/>
+        </w:rPr>
+        <w:t xml:space="preserve"> then</w:t>
+      </w:r>
+      <w:r>
+        <w:rPr>
+          <w:rFonts w:eastAsiaTheme="minorEastAsia"/>
+        </w:rPr>
+        <w:t xml:space="preserve"> be </w:t>
+      </w:r>
+      <w:proofErr w:type="gramStart"/>
+      <w:r>
+        <w:rPr>
+          <w:rFonts w:eastAsiaTheme="minorEastAsia"/>
+        </w:rPr>
+        <w:t>determined</w:t>
+      </w:r>
+      <w:proofErr w:type="gramEnd"/>
+      <w:r>
+        <w:rPr>
+          <w:rFonts w:eastAsiaTheme="minorEastAsia"/>
+        </w:rPr>
+        <w:t xml:space="preserve"> </w:t>
+      </w:r>
+      <w:r>
+        <w:rPr>
+          <w:rFonts w:eastAsiaTheme="minorEastAsia"/>
+        </w:rPr>
+        <w:t>by</w:t>
+      </w:r>
+      <w:r>
+        <w:rPr>
+          <w:rFonts w:eastAsiaTheme="minorEastAsia"/>
+        </w:rPr>
+        <w:t xml:space="preserve"> linear interpolation with the left side as the y variable and t as the x variable.  </w:t>
       </w:r>
     </w:p>
     <w:p>
       <w:pPr>
         <w:pStyle w:val="Heading1"/>
       </w:pPr>
-      <w:proofErr w:type="spellStart"/>
-      <w:r>
-        <w:t>QuantAQ</w:t>
-      </w:r>
-      <w:proofErr w:type="spellEnd"/>
-      <w:r>
-        <w:t xml:space="preserve"> Particle Analysis:</w:t>
+      <w:r>
+        <w:t>QuantAQ Particle Analysis:</w:t>
       </w:r>
     </w:p>
     <w:p>
       <w:r>
-        <w:t xml:space="preserve">Need to combine two </w:t>
-      </w:r>
-      <w:proofErr w:type="spellStart"/>
-      <w:r>
-        <w:t>QuantAQ</w:t>
-      </w:r>
-      <w:proofErr w:type="spellEnd"/>
-      <w:r>
-        <w:t xml:space="preserve"> files: Inside, Outside</w:t>
+        <w:t>Need to combine two QuantAQ files: Inside, Outside</w:t>
       </w:r>
     </w:p>
     <w:p>
@@ -1677,7 +1881,6 @@
         </w:rPr>
         <w:t xml:space="preserve">Smooth the combined data using </w:t>
       </w:r>
-      <w:proofErr w:type="gramStart"/>
       <w:r>
         <w:rPr>
           <w:b/>
@@ -1686,9 +1889,8 @@
           <w:iCs/>
           <w:color w:val="FF0000"/>
         </w:rPr>
-        <w:t>5 minute</w:t>
-      </w:r>
-      <w:proofErr w:type="gramEnd"/>
+        <w:t>5-minute</w:t>
+      </w:r>
       <w:r>
         <w:rPr>
           <w:b/>
@@ -1697,7 +1899,7 @@
           <w:iCs/>
           <w:color w:val="FF0000"/>
         </w:rPr>
-        <w:t xml:space="preserve"> rolling averages.  </w:t>
+        <w:t xml:space="preserve"> rolling averages.</w:t>
       </w:r>
     </w:p>
     <w:p>
@@ -1784,19 +1986,13 @@
         <w:rPr>
           <w:color w:val="E97132" w:themeColor="accent2"/>
         </w:rPr>
-        <w:t>less in</w:t>
+        <w:t>lower in these size ranges than</w:t>
       </w:r>
       <w:r>
         <w:rPr>
           <w:color w:val="E97132" w:themeColor="accent2"/>
         </w:rPr>
-        <w:t xml:space="preserve"> these size ranges</w:t>
-      </w:r>
-      <w:r>
-        <w:rPr>
-          <w:color w:val="E97132" w:themeColor="accent2"/>
-        </w:rPr>
-        <w:t xml:space="preserve"> in comparison to deposition and ventilation losses</w:t>
+        <w:t xml:space="preserve"> deposition and ventilation losses</w:t>
       </w:r>
       <w:r>
         <w:t xml:space="preserve">. </w:t>
@@ -1819,10 +2015,19 @@
       </w:r>
       <w:proofErr w:type="spellEnd"/>
       <w:r>
-        <w:t xml:space="preserve"> is the effective deposition loss rate for the particle size</w:t>
-      </w:r>
-      <w:r>
-        <w:t xml:space="preserve"> and V is the volume of the bedroom (closet and bathroom are not included)</w:t>
+        <w:t xml:space="preserve"> is the effective deposition loss rate </w:t>
+      </w:r>
+      <w:r>
+        <w:t>for particles,</w:t>
+      </w:r>
+      <w:r>
+        <w:t xml:space="preserve"> and V is the volume of the bedroom (</w:t>
+      </w:r>
+      <w:r>
+        <w:t xml:space="preserve">excluding the </w:t>
+      </w:r>
+      <w:r>
+        <w:t>closet and bathroom)</w:t>
       </w:r>
       <w:r>
         <w:t xml:space="preserve">. </w:t>
@@ -2021,7 +2226,14 @@
               <w:rFonts w:ascii="Cambria Math"/>
               <w:color w:val="000000" w:themeColor="text1"/>
             </w:rPr>
-            <m:t>=p</m:t>
+            <m:t>=</m:t>
+          </m:r>
+          <m:r>
+            <w:rPr>
+              <w:rFonts w:ascii="Cambria Math"/>
+              <w:color w:val="000000" w:themeColor="text1"/>
+            </w:rPr>
+            <m:t>p</m:t>
           </m:r>
           <m:r>
             <w:rPr>
@@ -2121,7 +2333,14 @@
               <w:rFonts w:ascii="Cambria Math"/>
               <w:color w:val="000000" w:themeColor="text1"/>
             </w:rPr>
-            <m:t>C+</m:t>
+            <m:t>C</m:t>
+          </m:r>
+          <m:r>
+            <w:rPr>
+              <w:rFonts w:ascii="Cambria Math"/>
+              <w:color w:val="000000" w:themeColor="text1"/>
+            </w:rPr>
+            <m:t>+</m:t>
           </m:r>
           <m:f>
             <m:fPr>
@@ -2180,7 +2399,23 @@
           <w:rFonts w:eastAsiaTheme="minorEastAsia"/>
           <w:color w:val="000000" w:themeColor="text1"/>
         </w:rPr>
-        <w:t>P is solved by the ratio of C/C</w:t>
+        <w:t xml:space="preserve">P </w:t>
+      </w:r>
+      <w:proofErr w:type="gramStart"/>
+      <w:r>
+        <w:rPr>
+          <w:rFonts w:eastAsiaTheme="minorEastAsia"/>
+          <w:color w:val="000000" w:themeColor="text1"/>
+        </w:rPr>
+        <w:t>is solved</w:t>
+      </w:r>
+      <w:proofErr w:type="gramEnd"/>
+      <w:r>
+        <w:rPr>
+          <w:rFonts w:eastAsiaTheme="minorEastAsia"/>
+          <w:color w:val="000000" w:themeColor="text1"/>
+        </w:rPr>
+        <w:t xml:space="preserve"> by the ratio of C/C</w:t>
       </w:r>
       <w:r>
         <w:rPr>
@@ -2207,14 +2442,52 @@
         <w:rPr>
           <w:rFonts w:eastAsiaTheme="minorEastAsia"/>
         </w:rPr>
-        <w:t>between the 6 hours prior to shower and 1 hour prior to the shower being on</w:t>
-      </w:r>
-      <w:r>
-        <w:rPr>
-          <w:rFonts w:eastAsiaTheme="minorEastAsia"/>
-          <w:color w:val="000000" w:themeColor="text1"/>
-        </w:rPr>
-        <w:t>. It should be 0.7-</w:t>
+        <w:t xml:space="preserve">between the 6 hours </w:t>
+      </w:r>
+      <w:r>
+        <w:rPr>
+          <w:rFonts w:eastAsiaTheme="minorEastAsia"/>
+        </w:rPr>
+        <w:t>before</w:t>
+      </w:r>
+      <w:r>
+        <w:rPr>
+          <w:rFonts w:eastAsiaTheme="minorEastAsia"/>
+        </w:rPr>
+        <w:t xml:space="preserve"> </w:t>
+      </w:r>
+      <w:r>
+        <w:rPr>
+          <w:rFonts w:eastAsiaTheme="minorEastAsia"/>
+        </w:rPr>
+        <w:t xml:space="preserve">the </w:t>
+      </w:r>
+      <w:r>
+        <w:rPr>
+          <w:rFonts w:eastAsiaTheme="minorEastAsia"/>
+        </w:rPr>
+        <w:t>shower and 1 hour prior to the shower being on</w:t>
+      </w:r>
+      <w:r>
+        <w:rPr>
+          <w:rFonts w:eastAsiaTheme="minorEastAsia"/>
+          <w:color w:val="000000" w:themeColor="text1"/>
+        </w:rPr>
+        <w:t xml:space="preserve">. It should be </w:t>
+      </w:r>
+      <w:r>
+        <w:rPr>
+          <w:rFonts w:eastAsiaTheme="minorEastAsia"/>
+          <w:color w:val="000000" w:themeColor="text1"/>
+        </w:rPr>
+        <w:t xml:space="preserve">in the </w:t>
+      </w:r>
+      <w:r>
+        <w:rPr>
+          <w:rFonts w:eastAsiaTheme="minorEastAsia"/>
+          <w:color w:val="000000" w:themeColor="text1"/>
+        </w:rPr>
+        <w:t>0.7-</w:t>
       </w:r>
       <w:r>
         <w:rPr>
@@ -2228,14 +2501,30 @@
           <w:rFonts w:eastAsiaTheme="minorEastAsia"/>
           <w:color w:val="000000" w:themeColor="text1"/>
         </w:rPr>
-        <w:t xml:space="preserve"> range.</w:t>
-      </w:r>
-      <w:r>
-        <w:rPr>
-          <w:rFonts w:eastAsiaTheme="minorEastAsia"/>
-          <w:color w:val="000000" w:themeColor="text1"/>
-        </w:rPr>
-        <w:t xml:space="preserve">  P is limited to values between 0 and 1.0.  </w:t>
+        <w:t xml:space="preserve"> range</w:t>
+      </w:r>
+      <w:proofErr w:type="gramStart"/>
+      <w:r>
+        <w:rPr>
+          <w:rFonts w:eastAsiaTheme="minorEastAsia"/>
+          <w:color w:val="000000" w:themeColor="text1"/>
+        </w:rPr>
+        <w:t>.</w:t>
+      </w:r>
+      <w:r>
+        <w:rPr>
+          <w:rFonts w:eastAsiaTheme="minorEastAsia"/>
+          <w:color w:val="000000" w:themeColor="text1"/>
+        </w:rPr>
+        <w:t xml:space="preserve">  </w:t>
+      </w:r>
+      <w:proofErr w:type="gramEnd"/>
+      <w:r>
+        <w:rPr>
+          <w:rFonts w:eastAsiaTheme="minorEastAsia"/>
+          <w:color w:val="000000" w:themeColor="text1"/>
+        </w:rPr>
+        <w:t xml:space="preserve">P is limited to values between 0 and 1.0.  </w:t>
       </w:r>
     </w:p>
     <w:p>
@@ -2255,6 +2544,7 @@
           <w:rFonts w:eastAsiaTheme="minorEastAsia"/>
           <w:color w:val="000000" w:themeColor="text1"/>
         </w:rPr>
+        <w:lastRenderedPageBreak/>
         <w:t xml:space="preserve">The air change </w:t>
       </w:r>
       <w:proofErr w:type="gramStart"/>
@@ -2292,7 +2582,7 @@
           <w:rFonts w:eastAsiaTheme="minorEastAsia"/>
           <w:color w:val="000000" w:themeColor="text1"/>
         </w:rPr>
-        <w:t xml:space="preserve"> is </w:t>
+        <w:t xml:space="preserve"> </w:t>
       </w:r>
       <w:proofErr w:type="gramStart"/>
       <w:r>
@@ -2300,7 +2590,7 @@
           <w:rFonts w:eastAsiaTheme="minorEastAsia"/>
           <w:color w:val="000000" w:themeColor="text1"/>
         </w:rPr>
-        <w:t>solved from the</w:t>
+        <w:t>is solved</w:t>
       </w:r>
       <w:proofErr w:type="gramEnd"/>
       <w:r>
@@ -2308,7 +2598,7 @@
           <w:rFonts w:eastAsiaTheme="minorEastAsia"/>
           <w:color w:val="000000" w:themeColor="text1"/>
         </w:rPr>
-        <w:t xml:space="preserve"> CO</w:t>
+        <w:t xml:space="preserve"> from the CO</w:t>
       </w:r>
       <w:r>
         <w:rPr>
@@ -2342,7 +2632,6 @@
         <w:rPr>
           <w:rFonts w:ascii="Symbol" w:hAnsi="Symbol"/>
         </w:rPr>
-        <w:lastRenderedPageBreak/>
         <w:t>b</w:t>
       </w:r>
       <w:proofErr w:type="spellStart"/>
@@ -2359,16 +2648,13 @@
         </w:rPr>
         <w:t xml:space="preserve"> </w:t>
       </w:r>
-      <w:r>
-        <w:t xml:space="preserve">is </w:t>
-      </w:r>
       <w:proofErr w:type="gramStart"/>
       <w:r>
-        <w:t>solved for</w:t>
+        <w:t>is solved</w:t>
       </w:r>
       <w:proofErr w:type="gramEnd"/>
       <w:r>
-        <w:t xml:space="preserve"> when the E value is zero. Since C</w:t>
+        <w:t xml:space="preserve"> for when the E value is zero. Since C</w:t>
       </w:r>
       <w:r>
         <w:rPr>
@@ -2403,6 +2689,7 @@
       <w:r>
         <w:t xml:space="preserve">after the shower turns off.  The end time is 2 hours after the shower is off.  Calculate the </w:t>
       </w:r>
+      <w:proofErr w:type="gramStart"/>
       <w:r>
         <w:rPr>
           <w:rFonts w:ascii="Symbol" w:hAnsi="Symbol"/>
@@ -2417,6 +2704,7 @@
         <w:t>deposistion</w:t>
       </w:r>
       <w:proofErr w:type="spellEnd"/>
+      <w:proofErr w:type="gramEnd"/>
       <w:r>
         <w:rPr>
           <w:vertAlign w:val="subscript"/>
@@ -2424,16 +2712,19 @@
         <w:t xml:space="preserve"> </w:t>
       </w:r>
       <w:r>
-        <w:t xml:space="preserve">average value for all the fit values in the </w:t>
+        <w:t>average value for all the fit values in the 2</w:t>
+      </w:r>
+      <w:r>
+        <w:t>-</w:t>
+      </w:r>
+      <w:r>
+        <w:t>hour window</w:t>
       </w:r>
       <w:proofErr w:type="gramStart"/>
       <w:r>
-        <w:t>2 hour</w:t>
+        <w:t xml:space="preserve">.  </w:t>
       </w:r>
       <w:proofErr w:type="gramEnd"/>
-      <w:r>
-        <w:t xml:space="preserve"> window.  </w:t>
-      </w:r>
     </w:p>
     <w:p>
       <w:pPr>
@@ -2498,7 +2789,14 @@
                           <w:rFonts w:ascii="Cambria Math"/>
                           <w:color w:val="000000" w:themeColor="text1"/>
                         </w:rPr>
-                        <m:t>i+1</m:t>
+                        <m:t>i</m:t>
+                      </m:r>
+                      <m:r>
+                        <w:rPr>
+                          <w:rFonts w:ascii="Cambria Math"/>
+                          <w:color w:val="000000" w:themeColor="text1"/>
+                        </w:rPr>
+                        <m:t>+1</m:t>
                       </m:r>
                     </m:e>
                   </m:d>
@@ -2566,7 +2864,14 @@
               <w:rFonts w:ascii="Cambria Math"/>
               <w:color w:val="000000" w:themeColor="text1"/>
             </w:rPr>
-            <m:t>=p</m:t>
+            <m:t>=</m:t>
+          </m:r>
+          <m:r>
+            <w:rPr>
+              <w:rFonts w:ascii="Cambria Math"/>
+              <w:color w:val="000000" w:themeColor="text1"/>
+            </w:rPr>
+            <m:t>p</m:t>
           </m:r>
           <m:r>
             <w:rPr>
@@ -2600,7 +2905,21 @@
                   <w:rFonts w:ascii="Cambria Math"/>
                   <w:color w:val="000000" w:themeColor="text1"/>
                 </w:rPr>
-                <m:t>out,t</m:t>
+                <m:t>out</m:t>
+              </m:r>
+              <m:r>
+                <w:rPr>
+                  <w:rFonts w:ascii="Cambria Math"/>
+                  <w:color w:val="000000" w:themeColor="text1"/>
+                </w:rPr>
+                <m:t>,</m:t>
+              </m:r>
+              <m:r>
+                <w:rPr>
+                  <w:rFonts w:ascii="Cambria Math"/>
+                  <w:color w:val="000000" w:themeColor="text1"/>
+                </w:rPr>
+                <m:t>t</m:t>
               </m:r>
             </m:sub>
           </m:sSub>
@@ -2778,7 +3097,14 @@
                           <w:rFonts w:ascii="Cambria Math"/>
                           <w:color w:val="000000" w:themeColor="text1"/>
                         </w:rPr>
-                        <m:t>i+1</m:t>
+                        <m:t>i</m:t>
+                      </m:r>
+                      <m:r>
+                        <w:rPr>
+                          <w:rFonts w:ascii="Cambria Math"/>
+                          <w:color w:val="000000" w:themeColor="text1"/>
+                        </w:rPr>
+                        <m:t>+1</m:t>
                       </m:r>
                     </m:e>
                   </m:d>
@@ -2887,7 +3213,21 @@
                   <w:rFonts w:ascii="Cambria Math"/>
                   <w:color w:val="000000" w:themeColor="text1"/>
                 </w:rPr>
-                <m:t>out,t</m:t>
+                <m:t>out</m:t>
+              </m:r>
+              <m:r>
+                <w:rPr>
+                  <w:rFonts w:ascii="Cambria Math"/>
+                  <w:color w:val="000000" w:themeColor="text1"/>
+                </w:rPr>
+                <m:t>,</m:t>
+              </m:r>
+              <m:r>
+                <w:rPr>
+                  <w:rFonts w:ascii="Cambria Math"/>
+                  <w:color w:val="000000" w:themeColor="text1"/>
+                </w:rPr>
+                <m:t>t</m:t>
               </m:r>
             </m:sub>
           </m:sSub>
@@ -2896,7 +3236,14 @@
               <w:rFonts w:ascii="Cambria Math" w:hAnsi="Cambria Math"/>
               <w:color w:val="000000" w:themeColor="text1"/>
             </w:rPr>
-            <m:t>+λ</m:t>
+            <m:t>+</m:t>
+          </m:r>
+          <m:r>
+            <w:rPr>
+              <w:rFonts w:ascii="Cambria Math" w:hAnsi="Cambria Math"/>
+              <w:color w:val="000000" w:themeColor="text1"/>
+            </w:rPr>
+            <m:t>λ</m:t>
           </m:r>
           <m:sSub>
             <m:sSubPr>
@@ -3065,7 +3412,14 @@
                           <w:rFonts w:ascii="Cambria Math"/>
                           <w:color w:val="000000" w:themeColor="text1"/>
                         </w:rPr>
-                        <m:t>i+1</m:t>
+                        <m:t>i</m:t>
+                      </m:r>
+                      <m:r>
+                        <w:rPr>
+                          <w:rFonts w:ascii="Cambria Math"/>
+                          <w:color w:val="000000" w:themeColor="text1"/>
+                        </w:rPr>
+                        <m:t>+1</m:t>
                       </m:r>
                     </m:e>
                   </m:d>
@@ -3221,7 +3575,21 @@
                       <w:rFonts w:ascii="Cambria Math"/>
                       <w:color w:val="000000" w:themeColor="text1"/>
                     </w:rPr>
-                    <m:t>out,t</m:t>
+                    <m:t>out</m:t>
+                  </m:r>
+                  <m:r>
+                    <w:rPr>
+                      <w:rFonts w:ascii="Cambria Math"/>
+                      <w:color w:val="000000" w:themeColor="text1"/>
+                    </w:rPr>
+                    <m:t>,</m:t>
+                  </m:r>
+                  <m:r>
+                    <w:rPr>
+                      <w:rFonts w:ascii="Cambria Math"/>
+                      <w:color w:val="000000" w:themeColor="text1"/>
+                    </w:rPr>
+                    <m:t>t</m:t>
                   </m:r>
                 </m:sub>
               </m:sSub>
@@ -3270,7 +3638,14 @@
               <w:rFonts w:ascii="Cambria Math" w:hAnsi="Cambria Math"/>
               <w:color w:val="000000" w:themeColor="text1"/>
             </w:rPr>
-            <m:t>-λ</m:t>
+            <m:t>-</m:t>
+          </m:r>
+          <m:r>
+            <w:rPr>
+              <w:rFonts w:ascii="Cambria Math" w:hAnsi="Cambria Math"/>
+              <w:color w:val="000000" w:themeColor="text1"/>
+            </w:rPr>
+            <m:t>λ</m:t>
           </m:r>
           <m:r>
             <w:rPr>
@@ -3417,7 +3792,14 @@
                           <w:rFonts w:ascii="Cambria Math"/>
                           <w:color w:val="000000" w:themeColor="text1"/>
                         </w:rPr>
-                        <m:t>i+1</m:t>
+                        <m:t>i</m:t>
+                      </m:r>
+                      <m:r>
+                        <w:rPr>
+                          <w:rFonts w:ascii="Cambria Math"/>
+                          <w:color w:val="000000" w:themeColor="text1"/>
+                        </w:rPr>
+                        <m:t>+1</m:t>
                       </m:r>
                     </m:e>
                   </m:d>
@@ -3576,7 +3958,21 @@
                       <w:rFonts w:ascii="Cambria Math"/>
                       <w:color w:val="000000" w:themeColor="text1"/>
                     </w:rPr>
-                    <m:t>out,t</m:t>
+                    <m:t>out</m:t>
+                  </m:r>
+                  <m:r>
+                    <w:rPr>
+                      <w:rFonts w:ascii="Cambria Math"/>
+                      <w:color w:val="000000" w:themeColor="text1"/>
+                    </w:rPr>
+                    <m:t>,</m:t>
+                  </m:r>
+                  <m:r>
+                    <w:rPr>
+                      <w:rFonts w:ascii="Cambria Math"/>
+                      <w:color w:val="000000" w:themeColor="text1"/>
+                    </w:rPr>
+                    <m:t>t</m:t>
                   </m:r>
                 </m:sub>
               </m:sSub>
@@ -3618,7 +4014,14 @@
               <w:rFonts w:ascii="Cambria Math" w:hAnsi="Cambria Math"/>
               <w:color w:val="000000" w:themeColor="text1"/>
             </w:rPr>
-            <m:t>-λ</m:t>
+            <m:t>-</m:t>
+          </m:r>
+          <m:r>
+            <w:rPr>
+              <w:rFonts w:ascii="Cambria Math" w:hAnsi="Cambria Math"/>
+              <w:color w:val="000000" w:themeColor="text1"/>
+            </w:rPr>
+            <m:t>λ</m:t>
           </m:r>
         </m:oMath>
       </m:oMathPara>
@@ -3712,7 +4115,14 @@
               <w:rFonts w:ascii="Cambria Math" w:hAnsi="Cambria Math"/>
               <w:color w:val="A02B93" w:themeColor="accent5"/>
             </w:rPr>
-            <m:t>-λ</m:t>
+            <m:t>-</m:t>
+          </m:r>
+          <m:r>
+            <w:rPr>
+              <w:rFonts w:ascii="Cambria Math" w:hAnsi="Cambria Math"/>
+              <w:color w:val="A02B93" w:themeColor="accent5"/>
+            </w:rPr>
+            <m:t>λ</m:t>
           </m:r>
           <m:r>
             <w:rPr>
@@ -3775,7 +4185,14 @@
                           <w:rFonts w:ascii="Cambria Math"/>
                           <w:color w:val="A02B93" w:themeColor="accent5"/>
                         </w:rPr>
-                        <m:t>i+1</m:t>
+                        <m:t>i</m:t>
+                      </m:r>
+                      <m:r>
+                        <w:rPr>
+                          <w:rFonts w:ascii="Cambria Math"/>
+                          <w:color w:val="A02B93" w:themeColor="accent5"/>
+                        </w:rPr>
+                        <m:t>+1</m:t>
                       </m:r>
                     </m:e>
                   </m:d>
@@ -3888,7 +4305,21 @@
                       <w:rFonts w:ascii="Cambria Math"/>
                       <w:color w:val="A02B93" w:themeColor="accent5"/>
                     </w:rPr>
-                    <m:t>out,t</m:t>
+                    <m:t>out</m:t>
+                  </m:r>
+                  <m:r>
+                    <w:rPr>
+                      <w:rFonts w:ascii="Cambria Math"/>
+                      <w:color w:val="A02B93" w:themeColor="accent5"/>
+                    </w:rPr>
+                    <m:t>,</m:t>
+                  </m:r>
+                  <m:r>
+                    <w:rPr>
+                      <w:rFonts w:ascii="Cambria Math"/>
+                      <w:color w:val="A02B93" w:themeColor="accent5"/>
+                    </w:rPr>
+                    <m:t>t</m:t>
                   </m:r>
                 </m:sub>
               </m:sSub>
@@ -3957,11 +4388,19 @@
         </w:rPr>
         <w:t xml:space="preserve">mission rate </w:t>
       </w:r>
-      <w:r>
-        <w:rPr>
-          <w:rFonts w:eastAsiaTheme="minorEastAsia"/>
-        </w:rPr>
-        <w:t xml:space="preserve">is calculated numerically from the data points </w:t>
+      <w:proofErr w:type="gramStart"/>
+      <w:r>
+        <w:rPr>
+          <w:rFonts w:eastAsiaTheme="minorEastAsia"/>
+        </w:rPr>
+        <w:t>is calculated</w:t>
+      </w:r>
+      <w:proofErr w:type="gramEnd"/>
+      <w:r>
+        <w:rPr>
+          <w:rFonts w:eastAsiaTheme="minorEastAsia"/>
+        </w:rPr>
+        <w:t xml:space="preserve"> numerically from the data points </w:t>
       </w:r>
       <w:r>
         <w:rPr>
@@ -4015,14 +4454,12 @@
         </w:rPr>
         <w:t>b</w:t>
       </w:r>
-      <w:proofErr w:type="spellStart"/>
       <w:r>
         <w:rPr>
           <w:vertAlign w:val="subscript"/>
         </w:rPr>
-        <w:t>deposistion</w:t>
-      </w:r>
-      <w:proofErr w:type="spellEnd"/>
+        <w:t>deposition</w:t>
+      </w:r>
       <w:r>
         <w:rPr>
           <w:vertAlign w:val="subscript"/>
@@ -4096,7 +4533,14 @@
                           <w:rFonts w:ascii="Cambria Math"/>
                           <w:color w:val="000000" w:themeColor="text1"/>
                         </w:rPr>
-                        <m:t>i+1</m:t>
+                        <m:t>i</m:t>
+                      </m:r>
+                      <m:r>
+                        <w:rPr>
+                          <w:rFonts w:ascii="Cambria Math"/>
+                          <w:color w:val="000000" w:themeColor="text1"/>
+                        </w:rPr>
+                        <m:t>+1</m:t>
                       </m:r>
                     </m:e>
                   </m:d>
@@ -4164,7 +4608,14 @@
               <w:rFonts w:ascii="Cambria Math"/>
               <w:color w:val="000000" w:themeColor="text1"/>
             </w:rPr>
-            <m:t>=p</m:t>
+            <m:t>=</m:t>
+          </m:r>
+          <m:r>
+            <w:rPr>
+              <w:rFonts w:ascii="Cambria Math"/>
+              <w:color w:val="000000" w:themeColor="text1"/>
+            </w:rPr>
+            <m:t>p</m:t>
           </m:r>
           <m:r>
             <w:rPr>
@@ -4198,7 +4649,21 @@
                   <w:rFonts w:ascii="Cambria Math"/>
                   <w:color w:val="000000" w:themeColor="text1"/>
                 </w:rPr>
-                <m:t>out,t</m:t>
+                <m:t>out</m:t>
+              </m:r>
+              <m:r>
+                <w:rPr>
+                  <w:rFonts w:ascii="Cambria Math"/>
+                  <w:color w:val="000000" w:themeColor="text1"/>
+                </w:rPr>
+                <m:t>,</m:t>
+              </m:r>
+              <m:r>
+                <w:rPr>
+                  <w:rFonts w:ascii="Cambria Math"/>
+                  <w:color w:val="000000" w:themeColor="text1"/>
+                </w:rPr>
+                <m:t>t</m:t>
               </m:r>
             </m:sub>
           </m:sSub>
@@ -4492,7 +4957,14 @@
                           <w:rFonts w:ascii="Cambria Math"/>
                           <w:color w:val="000000" w:themeColor="text1"/>
                         </w:rPr>
-                        <m:t>i+1</m:t>
+                        <m:t>i</m:t>
+                      </m:r>
+                      <m:r>
+                        <w:rPr>
+                          <w:rFonts w:ascii="Cambria Math"/>
+                          <w:color w:val="000000" w:themeColor="text1"/>
+                        </w:rPr>
+                        <m:t>+1</m:t>
                       </m:r>
                     </m:e>
                   </m:d>
@@ -4560,7 +5032,14 @@
               <w:rFonts w:ascii="Cambria Math"/>
               <w:color w:val="000000" w:themeColor="text1"/>
             </w:rPr>
-            <m:t>+p</m:t>
+            <m:t>+</m:t>
+          </m:r>
+          <m:r>
+            <w:rPr>
+              <w:rFonts w:ascii="Cambria Math"/>
+              <w:color w:val="000000" w:themeColor="text1"/>
+            </w:rPr>
+            <m:t>p</m:t>
           </m:r>
           <m:r>
             <w:rPr>
@@ -4594,7 +5073,21 @@
                   <w:rFonts w:ascii="Cambria Math"/>
                   <w:color w:val="000000" w:themeColor="text1"/>
                 </w:rPr>
-                <m:t>out,t</m:t>
+                <m:t>out</m:t>
+              </m:r>
+              <m:r>
+                <w:rPr>
+                  <w:rFonts w:ascii="Cambria Math"/>
+                  <w:color w:val="000000" w:themeColor="text1"/>
+                </w:rPr>
+                <m:t>,</m:t>
+              </m:r>
+              <m:r>
+                <w:rPr>
+                  <w:rFonts w:ascii="Cambria Math"/>
+                  <w:color w:val="000000" w:themeColor="text1"/>
+                </w:rPr>
+                <m:t>t</m:t>
               </m:r>
             </m:sub>
           </m:sSub>
@@ -4826,7 +5319,14 @@
                               <w:rFonts w:ascii="Cambria Math"/>
                               <w:color w:val="000000" w:themeColor="text1"/>
                             </w:rPr>
-                            <m:t>i+1</m:t>
+                            <m:t>i</m:t>
+                          </m:r>
+                          <m:r>
+                            <w:rPr>
+                              <w:rFonts w:ascii="Cambria Math"/>
+                              <w:color w:val="000000" w:themeColor="text1"/>
+                            </w:rPr>
+                            <m:t>+1</m:t>
                           </m:r>
                         </m:e>
                       </m:d>
@@ -4896,7 +5396,14 @@
               <w:rFonts w:ascii="Cambria Math"/>
               <w:color w:val="000000" w:themeColor="text1"/>
             </w:rPr>
-            <m:t>+p</m:t>
+            <m:t>+</m:t>
+          </m:r>
+          <m:r>
+            <w:rPr>
+              <w:rFonts w:ascii="Cambria Math"/>
+              <w:color w:val="000000" w:themeColor="text1"/>
+            </w:rPr>
+            <m:t>p</m:t>
           </m:r>
           <m:r>
             <w:rPr>
@@ -4930,7 +5437,21 @@
                   <w:rFonts w:ascii="Cambria Math"/>
                   <w:color w:val="000000" w:themeColor="text1"/>
                 </w:rPr>
-                <m:t>out,t</m:t>
+                <m:t>out</m:t>
+              </m:r>
+              <m:r>
+                <w:rPr>
+                  <w:rFonts w:ascii="Cambria Math"/>
+                  <w:color w:val="000000" w:themeColor="text1"/>
+                </w:rPr>
+                <m:t>,</m:t>
+              </m:r>
+              <m:r>
+                <w:rPr>
+                  <w:rFonts w:ascii="Cambria Math"/>
+                  <w:color w:val="000000" w:themeColor="text1"/>
+                </w:rPr>
+                <m:t>t</m:t>
               </m:r>
             </m:sub>
           </m:sSub>
@@ -5136,7 +5657,21 @@
                   <w:rFonts w:ascii="Cambria Math"/>
                   <w:color w:val="A02B93" w:themeColor="accent5"/>
                 </w:rPr>
-                <m:t>out,t</m:t>
+                <m:t>out</m:t>
+              </m:r>
+              <m:r>
+                <w:rPr>
+                  <w:rFonts w:ascii="Cambria Math"/>
+                  <w:color w:val="A02B93" w:themeColor="accent5"/>
+                </w:rPr>
+                <m:t>,</m:t>
+              </m:r>
+              <m:r>
+                <w:rPr>
+                  <w:rFonts w:ascii="Cambria Math"/>
+                  <w:color w:val="A02B93" w:themeColor="accent5"/>
+                </w:rPr>
+                <m:t>t</m:t>
               </m:r>
             </m:sub>
           </m:sSub>
@@ -5221,7 +5756,14 @@
                           <w:rFonts w:ascii="Cambria Math" w:hAnsi="Cambria Math"/>
                           <w:color w:val="A02B93" w:themeColor="accent5"/>
                         </w:rPr>
-                        <m:t>-C</m:t>
+                        <m:t>-</m:t>
+                      </m:r>
+                      <m:r>
+                        <w:rPr>
+                          <w:rFonts w:ascii="Cambria Math" w:hAnsi="Cambria Math"/>
+                          <w:color w:val="A02B93" w:themeColor="accent5"/>
+                        </w:rPr>
+                        <m:t>C</m:t>
                       </m:r>
                     </m:e>
                     <m:sub>
@@ -5248,7 +5790,14 @@
                               <w:rFonts w:ascii="Cambria Math"/>
                               <w:color w:val="A02B93" w:themeColor="accent5"/>
                             </w:rPr>
-                            <m:t>i+1</m:t>
+                            <m:t>i</m:t>
+                          </m:r>
+                          <m:r>
+                            <w:rPr>
+                              <w:rFonts w:ascii="Cambria Math"/>
+                              <w:color w:val="A02B93" w:themeColor="accent5"/>
+                            </w:rPr>
+                            <m:t>+1</m:t>
                           </m:r>
                         </m:e>
                       </m:d>
@@ -5412,7 +5961,19 @@
         <w:rPr>
           <w:rFonts w:eastAsiaTheme="minorEastAsia"/>
         </w:rPr>
-        <w:t>For each bin size calculate the C</w:t>
+        <w:t>For each bin size</w:t>
+      </w:r>
+      <w:r>
+        <w:rPr>
+          <w:rFonts w:eastAsiaTheme="minorEastAsia"/>
+        </w:rPr>
+        <w:t>,</w:t>
+      </w:r>
+      <w:r>
+        <w:rPr>
+          <w:rFonts w:eastAsiaTheme="minorEastAsia"/>
+        </w:rPr>
+        <w:t xml:space="preserve"> calculate the C</w:t>
       </w:r>
       <w:r>
         <w:rPr>
@@ -5423,13 +5984,25 @@
       <w:r>
         <w:t xml:space="preserve"> value for the </w:t>
       </w:r>
+      <w:r>
+        <w:t>period</w:t>
+      </w:r>
+      <w:r>
+        <w:t xml:space="preserve"> </w:t>
+      </w:r>
+      <w:r>
+        <w:t>from</w:t>
+      </w:r>
+      <w:r>
+        <w:t xml:space="preserve"> when that shower turns on until 2 h after the shower is turned off</w:t>
+      </w:r>
       <w:proofErr w:type="gramStart"/>
       <w:r>
-        <w:t>time period</w:t>
+        <w:t xml:space="preserve">.  </w:t>
       </w:r>
       <w:proofErr w:type="gramEnd"/>
       <w:r>
-        <w:t xml:space="preserve"> of when that shower turns on until 2 h after the shower is turned off.  Use the E</w:t>
+        <w:t>Use the E</w:t>
       </w:r>
       <w:r>
         <w:rPr>
@@ -5440,57 +6013,72 @@
       <w:r>
         <w:t xml:space="preserve"> value calculated in step 4 from the time the shower turns on until the peak concentration.  After that </w:t>
       </w:r>
+      <w:r>
+        <w:t>time,</w:t>
+      </w:r>
+      <w:r>
+        <w:t xml:space="preserve"> set </w:t>
+      </w:r>
+      <w:r>
+        <w:t xml:space="preserve">the </w:t>
+      </w:r>
+      <w:r>
+        <w:t>E</w:t>
+      </w:r>
+      <w:r>
+        <w:rPr>
+          <w:vertAlign w:val="subscript"/>
+        </w:rPr>
+        <w:t>t</w:t>
+      </w:r>
+      <w:r>
+        <w:t xml:space="preserve"> value to zero. Use the </w:t>
+      </w:r>
+      <w:r>
+        <w:rPr>
+          <w:rFonts w:ascii="Symbol" w:hAnsi="Symbol"/>
+        </w:rPr>
+        <w:t>b</w:t>
+      </w:r>
+      <w:proofErr w:type="spellStart"/>
+      <w:r>
+        <w:rPr>
+          <w:vertAlign w:val="subscript"/>
+        </w:rPr>
+        <w:t>deposistion</w:t>
+      </w:r>
+      <w:proofErr w:type="spellEnd"/>
+      <w:r>
+        <w:rPr>
+          <w:vertAlign w:val="subscript"/>
+        </w:rPr>
+        <w:t xml:space="preserve"> </w:t>
+      </w:r>
+      <w:r>
+        <w:t xml:space="preserve">average value for all time points. The </w:t>
+      </w:r>
       <w:proofErr w:type="gramStart"/>
       <w:r>
-        <w:t>time</w:t>
+        <w:t>initial</w:t>
       </w:r>
       <w:proofErr w:type="gramEnd"/>
       <w:r>
-        <w:t xml:space="preserve"> set </w:t>
-      </w:r>
-      <w:r>
-        <w:t>E</w:t>
+        <w:t xml:space="preserve"> C</w:t>
       </w:r>
       <w:r>
         <w:rPr>
           <w:vertAlign w:val="subscript"/>
         </w:rPr>
-        <w:t>t</w:t>
-      </w:r>
-      <w:r>
-        <w:t xml:space="preserve"> value to zero.  Use the </w:t>
-      </w:r>
-      <w:r>
-        <w:rPr>
-          <w:rFonts w:ascii="Symbol" w:hAnsi="Symbol"/>
-        </w:rPr>
-        <w:t>b</w:t>
-      </w:r>
-      <w:proofErr w:type="spellStart"/>
-      <w:r>
-        <w:rPr>
-          <w:vertAlign w:val="subscript"/>
-        </w:rPr>
-        <w:t>deposistion</w:t>
-      </w:r>
-      <w:proofErr w:type="spellEnd"/>
-      <w:r>
-        <w:rPr>
-          <w:vertAlign w:val="subscript"/>
-        </w:rPr>
-        <w:t xml:space="preserve"> </w:t>
-      </w:r>
-      <w:r>
-        <w:t>average value for all time points. The initial C</w:t>
-      </w:r>
-      <w:r>
-        <w:rPr>
-          <w:vertAlign w:val="subscript"/>
-        </w:rPr>
         <w:t>o</w:t>
       </w:r>
       <w:r>
-        <w:t xml:space="preserve"> value should be set to the bin size concentration at time the shower is turned on.  </w:t>
+        <w:t xml:space="preserve"> value should be set to the bin size concentration at </w:t>
+      </w:r>
+      <w:r>
+        <w:t xml:space="preserve">the </w:t>
+      </w:r>
+      <w:r>
+        <w:t xml:space="preserve">time the shower is turned on.  </w:t>
       </w:r>
       <w:r>
         <w:t xml:space="preserve">Plot the fit </w:t>
@@ -5582,7 +6170,14 @@
                           <w:rFonts w:ascii="Cambria Math"/>
                           <w:color w:val="000000" w:themeColor="text1"/>
                         </w:rPr>
-                        <m:t>i+1</m:t>
+                        <m:t>i</m:t>
+                      </m:r>
+                      <m:r>
+                        <w:rPr>
+                          <w:rFonts w:ascii="Cambria Math"/>
+                          <w:color w:val="000000" w:themeColor="text1"/>
+                        </w:rPr>
+                        <m:t>+1</m:t>
                       </m:r>
                     </m:e>
                   </m:d>
@@ -5650,7 +6245,14 @@
               <w:rFonts w:ascii="Cambria Math"/>
               <w:color w:val="000000" w:themeColor="text1"/>
             </w:rPr>
-            <m:t>=p</m:t>
+            <m:t>=</m:t>
+          </m:r>
+          <m:r>
+            <w:rPr>
+              <w:rFonts w:ascii="Cambria Math"/>
+              <w:color w:val="000000" w:themeColor="text1"/>
+            </w:rPr>
+            <m:t>p</m:t>
           </m:r>
           <m:r>
             <w:rPr>
@@ -5684,7 +6286,21 @@
                   <w:rFonts w:ascii="Cambria Math"/>
                   <w:color w:val="000000" w:themeColor="text1"/>
                 </w:rPr>
-                <m:t>out,t</m:t>
+                <m:t>out</m:t>
+              </m:r>
+              <m:r>
+                <w:rPr>
+                  <w:rFonts w:ascii="Cambria Math"/>
+                  <w:color w:val="000000" w:themeColor="text1"/>
+                </w:rPr>
+                <m:t>,</m:t>
+              </m:r>
+              <m:r>
+                <w:rPr>
+                  <w:rFonts w:ascii="Cambria Math"/>
+                  <w:color w:val="000000" w:themeColor="text1"/>
+                </w:rPr>
+                <m:t>t</m:t>
               </m:r>
             </m:sub>
           </m:sSub>
@@ -5854,7 +6470,7 @@
         </m:oMath>
       </m:oMathPara>
     </w:p>
-    <w:bookmarkStart w:id="4" w:name="_Hlk221705214"/>
+    <w:bookmarkStart w:id="27" w:name="_Hlk221705214"/>
     <w:p>
       <w:pPr>
         <w:rPr>
@@ -5918,7 +6534,14 @@
                           <w:rFonts w:ascii="Cambria Math"/>
                           <w:color w:val="000000" w:themeColor="text1"/>
                         </w:rPr>
-                        <m:t>i+1</m:t>
+                        <m:t>i</m:t>
+                      </m:r>
+                      <m:r>
+                        <w:rPr>
+                          <w:rFonts w:ascii="Cambria Math"/>
+                          <w:color w:val="000000" w:themeColor="text1"/>
+                        </w:rPr>
+                        <m:t>+1</m:t>
                       </m:r>
                     </m:e>
                   </m:d>
@@ -6018,7 +6641,14 @@
               <w:rFonts w:ascii="Cambria Math"/>
               <w:color w:val="000000" w:themeColor="text1"/>
             </w:rPr>
-            <m:t>+p</m:t>
+            <m:t>+</m:t>
+          </m:r>
+          <m:r>
+            <w:rPr>
+              <w:rFonts w:ascii="Cambria Math"/>
+              <w:color w:val="000000" w:themeColor="text1"/>
+            </w:rPr>
+            <m:t>p</m:t>
           </m:r>
           <m:r>
             <w:rPr>
@@ -6052,7 +6682,21 @@
                   <w:rFonts w:ascii="Cambria Math"/>
                   <w:color w:val="000000" w:themeColor="text1"/>
                 </w:rPr>
-                <m:t>out,t</m:t>
+                <m:t>out</m:t>
+              </m:r>
+              <m:r>
+                <w:rPr>
+                  <w:rFonts w:ascii="Cambria Math"/>
+                  <w:color w:val="000000" w:themeColor="text1"/>
+                </w:rPr>
+                <m:t>,</m:t>
+              </m:r>
+              <m:r>
+                <w:rPr>
+                  <w:rFonts w:ascii="Cambria Math"/>
+                  <w:color w:val="000000" w:themeColor="text1"/>
+                </w:rPr>
+                <m:t>t</m:t>
               </m:r>
             </m:sub>
           </m:sSub>
@@ -6108,7 +6752,14 @@
                   <w:rFonts w:ascii="Cambria Math" w:hAnsi="Cambria Math"/>
                   <w:color w:val="000000" w:themeColor="text1"/>
                 </w:rPr>
-                <m:t>λ+</m:t>
+                <m:t>λ</m:t>
+              </m:r>
+              <m:r>
+                <w:rPr>
+                  <w:rFonts w:ascii="Cambria Math" w:hAnsi="Cambria Math"/>
+                  <w:color w:val="000000" w:themeColor="text1"/>
+                </w:rPr>
+                <m:t>+</m:t>
               </m:r>
               <m:sSub>
                 <m:sSubPr>
@@ -6197,7 +6848,7 @@
         </m:oMath>
       </m:oMathPara>
     </w:p>
-    <w:bookmarkEnd w:id="4"/>
+    <w:bookmarkEnd w:id="27"/>
     <w:p>
       <w:pPr>
         <w:rPr>
@@ -6250,7 +6901,14 @@
                       <w:rFonts w:ascii="Cambria Math"/>
                       <w:color w:val="7030A0"/>
                     </w:rPr>
-                    <m:t>i+1</m:t>
+                    <m:t>i</m:t>
+                  </m:r>
+                  <m:r>
+                    <w:rPr>
+                      <w:rFonts w:ascii="Cambria Math"/>
+                      <w:color w:val="7030A0"/>
+                    </w:rPr>
+                    <m:t>+1</m:t>
                   </m:r>
                 </m:e>
               </m:d>
@@ -6368,7 +7026,21 @@
                       <w:rFonts w:ascii="Cambria Math"/>
                       <w:color w:val="7030A0"/>
                     </w:rPr>
-                    <m:t>out,t</m:t>
+                    <m:t>out</m:t>
+                  </m:r>
+                  <m:r>
+                    <w:rPr>
+                      <w:rFonts w:ascii="Cambria Math"/>
+                      <w:color w:val="7030A0"/>
+                    </w:rPr>
+                    <m:t>,</m:t>
+                  </m:r>
+                  <m:r>
+                    <w:rPr>
+                      <w:rFonts w:ascii="Cambria Math"/>
+                      <w:color w:val="7030A0"/>
+                    </w:rPr>
+                    <m:t>t</m:t>
                   </m:r>
                 </m:sub>
               </m:sSub>
@@ -6424,7 +7096,14 @@
                       <w:rFonts w:ascii="Cambria Math" w:hAnsi="Cambria Math"/>
                       <w:color w:val="7030A0"/>
                     </w:rPr>
-                    <m:t>λ+</m:t>
+                    <m:t>λ</m:t>
+                  </m:r>
+                  <m:r>
+                    <w:rPr>
+                      <w:rFonts w:ascii="Cambria Math" w:hAnsi="Cambria Math"/>
+                      <w:color w:val="7030A0"/>
+                    </w:rPr>
+                    <m:t>+</m:t>
                   </m:r>
                   <m:sSub>
                     <m:sSubPr>
@@ -6535,7 +7214,19 @@
         <w:rPr>
           <w:rFonts w:eastAsiaTheme="minorEastAsia"/>
         </w:rPr>
-        <w:t xml:space="preserve">For each bin size calculate </w:t>
+        <w:t>For each bin size</w:t>
+      </w:r>
+      <w:r>
+        <w:rPr>
+          <w:rFonts w:eastAsiaTheme="minorEastAsia"/>
+        </w:rPr>
+        <w:t>,</w:t>
+      </w:r>
+      <w:r>
+        <w:rPr>
+          <w:rFonts w:eastAsiaTheme="minorEastAsia"/>
+        </w:rPr>
+        <w:t xml:space="preserve"> calculate </w:t>
       </w:r>
       <w:proofErr w:type="spellStart"/>
       <w:r>
@@ -6552,8 +7243,13 @@
         <w:t>total</w:t>
       </w:r>
       <w:proofErr w:type="spellEnd"/>
-      <w:r>
-        <w:t>.  This is the</w:t>
+      <w:proofErr w:type="gramStart"/>
+      <w:r>
+        <w:t xml:space="preserve">.  </w:t>
+      </w:r>
+      <w:proofErr w:type="gramEnd"/>
+      <w:r>
+        <w:t>This is the</w:t>
       </w:r>
       <w:r>
         <w:t xml:space="preserve"> area under the curve of E</w:t>
@@ -6567,17 +7263,17 @@
       <w:r>
         <w:t xml:space="preserve"> versus time</w:t>
       </w:r>
-      <w:ins w:id="5" w:author="Lima, Nathan" w:date="2026-02-17T15:37:00Z">
+      <w:ins w:id="28" w:author="Lima, Nathan" w:date="2026-02-17T15:37:00Z">
         <w:r>
           <w:t>, computed using the trapezoidal rule:</w:t>
         </w:r>
       </w:ins>
-      <w:del w:id="6" w:author="Lima, Nathan" w:date="2026-02-17T15:37:00Z" w16du:dateUtc="2026-02-17T20:37:00Z">
+      <w:del w:id="29" w:author="Lima, Nathan" w:date="2026-02-17T15:37:00Z" w16du:dateUtc="2026-02-17T20:37:00Z">
         <w:r>
           <w:delText>.</w:delText>
         </w:r>
       </w:del>
-      <w:ins w:id="7" w:author="Lima, Nathan" w:date="2026-02-17T15:39:00Z" w16du:dateUtc="2026-02-17T20:39:00Z">
+      <w:ins w:id="30" w:author="Lima, Nathan" w:date="2026-02-17T15:39:00Z" w16du:dateUtc="2026-02-17T20:39:00Z">
         <w:r>
           <w:br/>
         </w:r>
@@ -6587,7 +7283,7 @@
           <m:sSub>
             <m:sSubPr>
               <m:ctrlPr>
-                <w:ins w:id="8" w:author="Lima, Nathan" w:date="2026-02-17T15:40:00Z" w16du:dateUtc="2026-02-17T20:40:00Z">
+                <w:ins w:id="31" w:author="Lima, Nathan" w:date="2026-02-17T15:40:00Z" w16du:dateUtc="2026-02-17T20:40:00Z">
                   <w:rPr>
                     <w:rFonts w:ascii="Cambria Math" w:hAnsi="Cambria Math"/>
                     <w:i/>
@@ -6598,7 +7294,7 @@
             </m:sSubPr>
             <m:e>
               <m:r>
-                <w:ins w:id="9" w:author="Lima, Nathan" w:date="2026-02-17T15:40:00Z" w16du:dateUtc="2026-02-17T20:40:00Z">
+                <w:ins w:id="32" w:author="Lima, Nathan" w:date="2026-02-17T15:40:00Z" w16du:dateUtc="2026-02-17T20:40:00Z">
                   <w:rPr>
                     <w:rFonts w:ascii="Cambria Math" w:hAnsi="Cambria Math"/>
                     <w:color w:val="7030A0"/>
@@ -6609,7 +7305,7 @@
             </m:e>
             <m:sub>
               <m:r>
-                <w:ins w:id="10" w:author="Lima, Nathan" w:date="2026-02-17T15:40:00Z" w16du:dateUtc="2026-02-17T20:40:00Z">
+                <w:ins w:id="33" w:author="Lima, Nathan" w:date="2026-02-17T15:40:00Z" w16du:dateUtc="2026-02-17T20:40:00Z">
                   <w:rPr>
                     <w:rFonts w:ascii="Cambria Math"/>
                     <w:color w:val="7030A0"/>
@@ -6618,7 +7314,7 @@
                 </w:ins>
               </m:r>
               <m:r>
-                <w:ins w:id="11" w:author="Lima, Nathan" w:date="2026-02-17T15:40:00Z" w16du:dateUtc="2026-02-17T20:40:00Z">
+                <w:ins w:id="34" w:author="Lima, Nathan" w:date="2026-02-17T15:40:00Z" w16du:dateUtc="2026-02-17T20:40:00Z">
                   <w:rPr>
                     <w:rFonts w:ascii="Cambria Math" w:hAnsi="Cambria Math"/>
                     <w:color w:val="7030A0"/>
@@ -6629,7 +7325,7 @@
             </m:sub>
           </m:sSub>
           <m:r>
-            <w:ins w:id="12" w:author="Lima, Nathan" w:date="2026-02-17T15:40:00Z" w16du:dateUtc="2026-02-17T20:40:00Z">
+            <w:ins w:id="35" w:author="Lima, Nathan" w:date="2026-02-17T15:40:00Z" w16du:dateUtc="2026-02-17T20:40:00Z">
               <w:rPr>
                 <w:rFonts w:ascii="Cambria Math"/>
                 <w:color w:val="7030A0"/>
@@ -6638,7 +7334,7 @@
             </w:ins>
           </m:r>
           <m:r>
-            <w:ins w:id="13" w:author="Lima, Nathan" w:date="2026-02-17T15:40:00Z" w16du:dateUtc="2026-02-17T20:40:00Z">
+            <w:ins w:id="36" w:author="Lima, Nathan" w:date="2026-02-17T15:40:00Z" w16du:dateUtc="2026-02-17T20:40:00Z">
               <w:rPr>
                 <w:rFonts w:ascii="Cambria Math" w:hAnsi="Cambria Math"/>
                 <w:color w:val="7030A0"/>
@@ -6653,7 +7349,7 @@
               <m:subHide m:val="1"/>
               <m:supHide m:val="1"/>
               <m:ctrlPr>
-                <w:ins w:id="14" w:author="Lima, Nathan" w:date="2026-02-17T15:40:00Z" w16du:dateUtc="2026-02-17T20:40:00Z">
+                <w:ins w:id="37" w:author="Lima, Nathan" w:date="2026-02-17T15:40:00Z" w16du:dateUtc="2026-02-17T20:40:00Z">
                   <w:rPr>
                     <w:rFonts w:ascii="Cambria Math" w:hAnsi="Cambria Math"/>
                     <w:i/>
@@ -6668,7 +7364,7 @@
               <m:f>
                 <m:fPr>
                   <m:ctrlPr>
-                    <w:ins w:id="15" w:author="Lima, Nathan" w:date="2026-02-17T15:40:00Z" w16du:dateUtc="2026-02-17T20:40:00Z">
+                    <w:ins w:id="38" w:author="Lima, Nathan" w:date="2026-02-17T15:40:00Z" w16du:dateUtc="2026-02-17T20:40:00Z">
                       <w:rPr>
                         <w:rFonts w:ascii="Cambria Math" w:hAnsi="Cambria Math"/>
                         <w:i/>
@@ -6681,7 +7377,7 @@
                   <m:sSub>
                     <m:sSubPr>
                       <m:ctrlPr>
-                        <w:ins w:id="16" w:author="Lima, Nathan" w:date="2026-02-17T15:40:00Z" w16du:dateUtc="2026-02-17T20:40:00Z">
+                        <w:ins w:id="39" w:author="Lima, Nathan" w:date="2026-02-17T15:40:00Z" w16du:dateUtc="2026-02-17T20:40:00Z">
                           <w:rPr>
                             <w:rFonts w:ascii="Cambria Math" w:hAnsi="Cambria Math"/>
                             <w:i/>
@@ -6692,7 +7388,7 @@
                     </m:sSubPr>
                     <m:e>
                       <m:r>
-                        <w:ins w:id="17" w:author="Lima, Nathan" w:date="2026-02-17T15:40:00Z" w16du:dateUtc="2026-02-17T20:40:00Z">
+                        <w:ins w:id="40" w:author="Lima, Nathan" w:date="2026-02-17T15:40:00Z" w16du:dateUtc="2026-02-17T20:40:00Z">
                           <w:rPr>
                             <w:rFonts w:ascii="Cambria Math" w:hAnsi="Cambria Math"/>
                             <w:color w:val="7030A0"/>
@@ -6703,7 +7399,7 @@
                     </m:e>
                     <m:sub>
                       <m:r>
-                        <w:ins w:id="18" w:author="Lima, Nathan" w:date="2026-02-17T15:40:00Z" w16du:dateUtc="2026-02-17T20:40:00Z">
+                        <w:ins w:id="41" w:author="Lima, Nathan" w:date="2026-02-17T15:40:00Z" w16du:dateUtc="2026-02-17T20:40:00Z">
                           <w:rPr>
                             <w:rFonts w:ascii="Cambria Math"/>
                             <w:color w:val="7030A0"/>
@@ -6714,7 +7410,7 @@
                     </m:sub>
                   </m:sSub>
                   <m:r>
-                    <w:ins w:id="19" w:author="Lima, Nathan" w:date="2026-02-17T15:40:00Z" w16du:dateUtc="2026-02-17T20:40:00Z">
+                    <w:ins w:id="42" w:author="Lima, Nathan" w:date="2026-02-17T15:40:00Z" w16du:dateUtc="2026-02-17T20:40:00Z">
                       <w:rPr>
                         <w:rFonts w:ascii="Cambria Math"/>
                         <w:color w:val="A02B93" w:themeColor="accent5"/>
@@ -6725,7 +7421,7 @@
                   <m:sSub>
                     <m:sSubPr>
                       <m:ctrlPr>
-                        <w:ins w:id="20" w:author="Lima, Nathan" w:date="2026-02-17T15:40:00Z" w16du:dateUtc="2026-02-17T20:40:00Z">
+                        <w:ins w:id="43" w:author="Lima, Nathan" w:date="2026-02-17T15:40:00Z" w16du:dateUtc="2026-02-17T20:40:00Z">
                           <w:rPr>
                             <w:rFonts w:ascii="Cambria Math" w:hAnsi="Cambria Math"/>
                             <w:i/>
@@ -6736,7 +7432,7 @@
                     </m:sSubPr>
                     <m:e>
                       <m:r>
-                        <w:ins w:id="21" w:author="Lima, Nathan" w:date="2026-02-17T15:40:00Z" w16du:dateUtc="2026-02-17T20:40:00Z">
+                        <w:ins w:id="44" w:author="Lima, Nathan" w:date="2026-02-17T15:40:00Z" w16du:dateUtc="2026-02-17T20:40:00Z">
                           <w:rPr>
                             <w:rFonts w:ascii="Cambria Math" w:hAnsi="Cambria Math"/>
                             <w:color w:val="7030A0"/>
@@ -6747,7 +7443,7 @@
                     </m:e>
                     <m:sub>
                       <m:r>
-                        <w:ins w:id="22" w:author="Lima, Nathan" w:date="2026-02-17T15:40:00Z" w16du:dateUtc="2026-02-17T20:40:00Z">
+                        <w:ins w:id="45" w:author="Lima, Nathan" w:date="2026-02-17T15:40:00Z" w16du:dateUtc="2026-02-17T20:40:00Z">
                           <w:rPr>
                             <w:rFonts w:ascii="Cambria Math"/>
                             <w:color w:val="7030A0"/>
@@ -6758,7 +7454,7 @@
                       <m:d>
                         <m:dPr>
                           <m:ctrlPr>
-                            <w:ins w:id="23" w:author="Lima, Nathan" w:date="2026-02-17T15:40:00Z" w16du:dateUtc="2026-02-17T20:40:00Z">
+                            <w:ins w:id="46" w:author="Lima, Nathan" w:date="2026-02-17T15:40:00Z" w16du:dateUtc="2026-02-17T20:40:00Z">
                               <w:rPr>
                                 <w:rFonts w:ascii="Cambria Math" w:hAnsi="Cambria Math"/>
                                 <w:i/>
@@ -6769,7 +7465,7 @@
                         </m:dPr>
                         <m:e>
                           <m:r>
-                            <w:ins w:id="24" w:author="Lima, Nathan" w:date="2026-02-17T15:40:00Z" w16du:dateUtc="2026-02-17T20:40:00Z">
+                            <w:ins w:id="47" w:author="Lima, Nathan" w:date="2026-02-17T15:40:00Z" w16du:dateUtc="2026-02-17T20:40:00Z">
                               <w:rPr>
                                 <w:rFonts w:ascii="Cambria Math"/>
                                 <w:color w:val="7030A0"/>
@@ -6784,7 +7480,7 @@
                 </m:num>
                 <m:den>
                   <m:r>
-                    <w:ins w:id="25" w:author="Lima, Nathan" w:date="2026-02-17T15:40:00Z" w16du:dateUtc="2026-02-17T20:40:00Z">
+                    <w:ins w:id="48" w:author="Lima, Nathan" w:date="2026-02-17T15:40:00Z" w16du:dateUtc="2026-02-17T20:40:00Z">
                       <w:rPr>
                         <w:rFonts w:ascii="Cambria Math" w:hAnsi="Cambria Math"/>
                         <w:color w:val="7030A0"/>
@@ -6796,14 +7492,17 @@
               </m:f>
             </m:e>
           </m:nary>
-          <w:ins w:id="26" w:author="Lima, Nathan" w:date="2026-02-17T15:39:00Z" w16du:dateUtc="2026-02-17T20:39:00Z">
-            <m:r>
+          <m:r>
+            <w:ins w:id="49" w:author="Lima, Nathan" w:date="2026-02-17T15:39:00Z" w16du:dateUtc="2026-02-17T20:39:00Z">
+              <m:rPr>
+                <m:sty m:val="p"/>
+              </m:rPr>
               <w:br/>
-            </m:r>
-          </w:ins>
+            </w:ins>
+          </m:r>
         </m:oMath>
       </m:oMathPara>
-      <w:del w:id="27" w:author="Lima, Nathan" w:date="2026-02-17T15:39:00Z" w16du:dateUtc="2026-02-17T20:39:00Z">
+      <w:del w:id="50" w:author="Lima, Nathan" w:date="2026-02-17T15:39:00Z" w16du:dateUtc="2026-02-17T20:39:00Z">
         <w:r>
           <w:delText xml:space="preserve">  </w:delText>
         </w:r>
@@ -6811,7 +7510,7 @@
           <w:delText xml:space="preserve"> </w:delText>
         </w:r>
       </w:del>
-      <w:ins w:id="28" w:author="Lima, Nathan" w:date="2026-02-17T15:39:00Z">
+      <w:ins w:id="51" w:author="Lima, Nathan" w:date="2026-02-17T15:39:00Z">
         <w:r>
           <w:t>where the sum runs over all time steps from shower-on to peak concentration.</w:t>
         </w:r>
@@ -6821,7 +7520,7 @@
       <w:pPr>
         <w:ind w:left="360"/>
         <w:rPr>
-          <w:del w:id="29" w:author="Lima, Nathan" w:date="2026-02-17T15:40:00Z" w16du:dateUtc="2026-02-17T20:40:00Z"/>
+          <w:del w:id="52" w:author="Lima, Nathan" w:date="2026-02-17T15:40:00Z" w16du:dateUtc="2026-02-17T20:40:00Z"/>
           <w:rFonts w:eastAsiaTheme="minorEastAsia"/>
           <w:color w:val="7030A0"/>
         </w:rPr>
@@ -6831,7 +7530,7 @@
           <m:sSub>
             <m:sSubPr>
               <m:ctrlPr>
-                <w:del w:id="30" w:author="Lima, Nathan" w:date="2026-02-17T15:40:00Z" w16du:dateUtc="2026-02-17T20:40:00Z">
+                <w:del w:id="53" w:author="Lima, Nathan" w:date="2026-02-17T15:40:00Z" w16du:dateUtc="2026-02-17T20:40:00Z">
                   <w:rPr>
                     <w:rFonts w:ascii="Cambria Math" w:hAnsi="Cambria Math"/>
                     <w:i/>
@@ -6842,7 +7541,7 @@
             </m:sSubPr>
             <m:e>
               <m:r>
-                <w:del w:id="31" w:author="Lima, Nathan" w:date="2026-02-17T15:40:00Z" w16du:dateUtc="2026-02-17T20:40:00Z">
+                <w:del w:id="54" w:author="Lima, Nathan" w:date="2026-02-17T15:40:00Z" w16du:dateUtc="2026-02-17T20:40:00Z">
                   <w:rPr>
                     <w:rFonts w:ascii="Cambria Math" w:hAnsi="Cambria Math"/>
                     <w:color w:val="7030A0"/>
@@ -6853,7 +7552,7 @@
             </m:e>
             <m:sub>
               <m:r>
-                <w:del w:id="32" w:author="Lima, Nathan" w:date="2026-02-17T15:40:00Z" w16du:dateUtc="2026-02-17T20:40:00Z">
+                <w:del w:id="55" w:author="Lima, Nathan" w:date="2026-02-17T15:40:00Z" w16du:dateUtc="2026-02-17T20:40:00Z">
                   <w:rPr>
                     <w:rFonts w:ascii="Cambria Math"/>
                     <w:color w:val="7030A0"/>
@@ -6862,7 +7561,7 @@
                 </w:del>
               </m:r>
               <m:r>
-                <w:del w:id="33" w:author="Lima, Nathan" w:date="2026-02-17T15:40:00Z" w16du:dateUtc="2026-02-17T20:40:00Z">
+                <w:del w:id="56" w:author="Lima, Nathan" w:date="2026-02-17T15:40:00Z" w16du:dateUtc="2026-02-17T20:40:00Z">
                   <w:rPr>
                     <w:rFonts w:ascii="Cambria Math" w:hAnsi="Cambria Math"/>
                     <w:color w:val="7030A0"/>
@@ -6873,7 +7572,7 @@
             </m:sub>
           </m:sSub>
           <m:r>
-            <w:del w:id="34" w:author="Lima, Nathan" w:date="2026-02-17T15:40:00Z" w16du:dateUtc="2026-02-17T20:40:00Z">
+            <w:del w:id="57" w:author="Lima, Nathan" w:date="2026-02-17T15:40:00Z" w16du:dateUtc="2026-02-17T20:40:00Z">
               <w:rPr>
                 <w:rFonts w:ascii="Cambria Math"/>
                 <w:color w:val="7030A0"/>
@@ -6888,7 +7587,7 @@
               <m:subHide m:val="1"/>
               <m:supHide m:val="1"/>
               <m:ctrlPr>
-                <w:del w:id="35" w:author="Lima, Nathan" w:date="2026-02-17T15:40:00Z" w16du:dateUtc="2026-02-17T20:40:00Z">
+                <w:del w:id="58" w:author="Lima, Nathan" w:date="2026-02-17T15:40:00Z" w16du:dateUtc="2026-02-17T20:40:00Z">
                   <w:rPr>
                     <w:rFonts w:ascii="Cambria Math" w:hAnsi="Cambria Math"/>
                     <w:i/>
@@ -6903,7 +7602,7 @@
               <m:f>
                 <m:fPr>
                   <m:ctrlPr>
-                    <w:del w:id="36" w:author="Lima, Nathan" w:date="2026-02-17T15:40:00Z" w16du:dateUtc="2026-02-17T20:40:00Z">
+                    <w:del w:id="59" w:author="Lima, Nathan" w:date="2026-02-17T15:40:00Z" w16du:dateUtc="2026-02-17T20:40:00Z">
                       <w:rPr>
                         <w:rFonts w:ascii="Cambria Math" w:hAnsi="Cambria Math"/>
                         <w:i/>
@@ -6916,7 +7615,7 @@
                   <m:sSub>
                     <m:sSubPr>
                       <m:ctrlPr>
-                        <w:del w:id="37" w:author="Lima, Nathan" w:date="2026-02-17T15:40:00Z" w16du:dateUtc="2026-02-17T20:40:00Z">
+                        <w:del w:id="60" w:author="Lima, Nathan" w:date="2026-02-17T15:40:00Z" w16du:dateUtc="2026-02-17T20:40:00Z">
                           <w:rPr>
                             <w:rFonts w:ascii="Cambria Math" w:hAnsi="Cambria Math"/>
                             <w:i/>
@@ -6927,7 +7626,7 @@
                     </m:sSubPr>
                     <m:e>
                       <m:r>
-                        <w:del w:id="38" w:author="Lima, Nathan" w:date="2026-02-17T15:40:00Z" w16du:dateUtc="2026-02-17T20:40:00Z">
+                        <w:del w:id="61" w:author="Lima, Nathan" w:date="2026-02-17T15:40:00Z" w16du:dateUtc="2026-02-17T20:40:00Z">
                           <w:rPr>
                             <w:rFonts w:ascii="Cambria Math" w:hAnsi="Cambria Math"/>
                             <w:color w:val="7030A0"/>
@@ -6938,7 +7637,7 @@
                     </m:e>
                     <m:sub>
                       <m:r>
-                        <w:del w:id="39" w:author="Lima, Nathan" w:date="2026-02-17T15:40:00Z" w16du:dateUtc="2026-02-17T20:40:00Z">
+                        <w:del w:id="62" w:author="Lima, Nathan" w:date="2026-02-17T15:40:00Z" w16du:dateUtc="2026-02-17T20:40:00Z">
                           <w:rPr>
                             <w:rFonts w:ascii="Cambria Math"/>
                             <w:color w:val="7030A0"/>
@@ -6949,7 +7648,7 @@
                     </m:sub>
                   </m:sSub>
                   <m:r>
-                    <w:del w:id="40" w:author="Lima, Nathan" w:date="2026-02-17T15:40:00Z" w16du:dateUtc="2026-02-17T20:40:00Z">
+                    <w:del w:id="63" w:author="Lima, Nathan" w:date="2026-02-17T15:40:00Z" w16du:dateUtc="2026-02-17T20:40:00Z">
                       <w:rPr>
                         <w:rFonts w:ascii="Cambria Math"/>
                         <w:color w:val="A02B93" w:themeColor="accent5"/>
@@ -6960,7 +7659,7 @@
                   <m:sSub>
                     <m:sSubPr>
                       <m:ctrlPr>
-                        <w:del w:id="41" w:author="Lima, Nathan" w:date="2026-02-17T15:40:00Z" w16du:dateUtc="2026-02-17T20:40:00Z">
+                        <w:del w:id="64" w:author="Lima, Nathan" w:date="2026-02-17T15:40:00Z" w16du:dateUtc="2026-02-17T20:40:00Z">
                           <w:rPr>
                             <w:rFonts w:ascii="Cambria Math" w:hAnsi="Cambria Math"/>
                             <w:i/>
@@ -6971,7 +7670,7 @@
                     </m:sSubPr>
                     <m:e>
                       <m:r>
-                        <w:del w:id="42" w:author="Lima, Nathan" w:date="2026-02-17T15:40:00Z" w16du:dateUtc="2026-02-17T20:40:00Z">
+                        <w:del w:id="65" w:author="Lima, Nathan" w:date="2026-02-17T15:40:00Z" w16du:dateUtc="2026-02-17T20:40:00Z">
                           <w:rPr>
                             <w:rFonts w:ascii="Cambria Math" w:hAnsi="Cambria Math"/>
                             <w:color w:val="7030A0"/>
@@ -6982,7 +7681,7 @@
                     </m:e>
                     <m:sub>
                       <m:r>
-                        <w:del w:id="43" w:author="Lima, Nathan" w:date="2026-02-17T15:40:00Z" w16du:dateUtc="2026-02-17T20:40:00Z">
+                        <w:del w:id="66" w:author="Lima, Nathan" w:date="2026-02-17T15:40:00Z" w16du:dateUtc="2026-02-17T20:40:00Z">
                           <w:rPr>
                             <w:rFonts w:ascii="Cambria Math"/>
                             <w:color w:val="7030A0"/>
@@ -6993,7 +7692,7 @@
                       <m:d>
                         <m:dPr>
                           <m:ctrlPr>
-                            <w:del w:id="44" w:author="Lima, Nathan" w:date="2026-02-17T15:40:00Z" w16du:dateUtc="2026-02-17T20:40:00Z">
+                            <w:del w:id="67" w:author="Lima, Nathan" w:date="2026-02-17T15:40:00Z" w16du:dateUtc="2026-02-17T20:40:00Z">
                               <w:rPr>
                                 <w:rFonts w:ascii="Cambria Math" w:hAnsi="Cambria Math"/>
                                 <w:i/>
@@ -7004,12 +7703,21 @@
                         </m:dPr>
                         <m:e>
                           <m:r>
-                            <w:del w:id="45" w:author="Lima, Nathan" w:date="2026-02-17T15:40:00Z" w16du:dateUtc="2026-02-17T20:40:00Z">
+                            <w:del w:id="68" w:author="Lima, Nathan" w:date="2026-02-17T15:40:00Z" w16du:dateUtc="2026-02-17T20:40:00Z">
                               <w:rPr>
                                 <w:rFonts w:ascii="Cambria Math"/>
                                 <w:color w:val="7030A0"/>
                               </w:rPr>
-                              <m:t>i+1</m:t>
+                              <m:t>i</m:t>
+                            </w:del>
+                          </m:r>
+                          <m:r>
+                            <w:del w:id="69" w:author="Lima, Nathan" w:date="2026-02-17T15:40:00Z" w16du:dateUtc="2026-02-17T20:40:00Z">
+                              <w:rPr>
+                                <w:rFonts w:ascii="Cambria Math"/>
+                                <w:color w:val="7030A0"/>
+                              </w:rPr>
+                              <m:t>+1</m:t>
                             </w:del>
                           </m:r>
                         </m:e>
@@ -7019,7 +7727,7 @@
                 </m:num>
                 <m:den>
                   <m:r>
-                    <w:del w:id="46" w:author="Lima, Nathan" w:date="2026-02-17T15:40:00Z" w16du:dateUtc="2026-02-17T20:40:00Z">
+                    <w:del w:id="70" w:author="Lima, Nathan" w:date="2026-02-17T15:40:00Z" w16du:dateUtc="2026-02-17T20:40:00Z">
                       <w:rPr>
                         <w:rFonts w:ascii="Cambria Math" w:hAnsi="Cambria Math"/>
                         <w:color w:val="7030A0"/>
@@ -7058,39 +7766,7 @@
           <w:rFonts w:eastAsiaTheme="minorEastAsia"/>
           <w:color w:val="000000" w:themeColor="text1"/>
         </w:rPr>
-        <w:t xml:space="preserve">There are </w:t>
-      </w:r>
-      <w:ins w:id="47" w:author="Lima, Nathan M. (Fed)" w:date="2026-02-17T12:10:00Z" w16du:dateUtc="2026-02-17T17:10:00Z">
-        <w:r>
-          <w:rPr>
-            <w:rFonts w:eastAsiaTheme="minorEastAsia"/>
-            <w:color w:val="000000" w:themeColor="text1"/>
-          </w:rPr>
-          <w:t>four</w:t>
-        </w:r>
-      </w:ins>
-      <w:del w:id="48" w:author="Lima, Nathan M. (Fed)" w:date="2026-02-17T12:10:00Z" w16du:dateUtc="2026-02-17T17:10:00Z">
-        <w:r>
-          <w:rPr>
-            <w:rFonts w:eastAsiaTheme="minorEastAsia"/>
-            <w:color w:val="000000" w:themeColor="text1"/>
-          </w:rPr>
-          <w:delText>three</w:delText>
-        </w:r>
-      </w:del>
-      <w:r>
-        <w:rPr>
-          <w:rFonts w:eastAsiaTheme="minorEastAsia"/>
-          <w:color w:val="000000" w:themeColor="text1"/>
-        </w:rPr>
-        <w:t xml:space="preserve"> </w:t>
-      </w:r>
-      <w:r>
-        <w:rPr>
-          <w:rFonts w:eastAsiaTheme="minorEastAsia"/>
-          <w:color w:val="000000" w:themeColor="text1"/>
-        </w:rPr>
-        <w:t>types of instruments that measure</w:t>
+        <w:t>Four types of instruments measure</w:t>
       </w:r>
       <w:r>
         <w:rPr>
@@ -7147,7 +7823,7 @@
         </w:rPr>
         <w:t xml:space="preserve"> Entry</w:t>
       </w:r>
-      <w:ins w:id="49" w:author="Lima, Nathan M. (Fed)" w:date="2026-02-17T12:14:00Z" w16du:dateUtc="2026-02-17T17:14:00Z">
+      <w:ins w:id="71" w:author="Lima, Nathan M. (Fed)" w:date="2026-02-17T12:14:00Z" w16du:dateUtc="2026-02-17T17:14:00Z">
         <w:r>
           <w:rPr>
             <w:rFonts w:eastAsiaTheme="minorEastAsia"/>
@@ -7156,7 +7832,7 @@
           <w:t xml:space="preserve"> (Livingroom)</w:t>
         </w:r>
       </w:ins>
-      <w:del w:id="50" w:author="Lima, Nathan M. (Fed)" w:date="2026-02-17T12:12:00Z" w16du:dateUtc="2026-02-17T17:12:00Z">
+      <w:del w:id="72" w:author="Lima, Nathan M. (Fed)" w:date="2026-02-17T12:12:00Z" w16du:dateUtc="2026-02-17T17:12:00Z">
         <w:r>
           <w:rPr>
             <w:rFonts w:eastAsiaTheme="minorEastAsia"/>
@@ -7199,7 +7875,7 @@
         </w:rPr>
         <w:t xml:space="preserve"> Bedroom</w:t>
       </w:r>
-      <w:del w:id="51" w:author="Lima, Nathan M. (Fed)" w:date="2026-02-17T12:12:00Z" w16du:dateUtc="2026-02-17T17:12:00Z">
+      <w:del w:id="73" w:author="Lima, Nathan M. (Fed)" w:date="2026-02-17T12:12:00Z" w16du:dateUtc="2026-02-17T17:12:00Z">
         <w:r>
           <w:rPr>
             <w:rFonts w:eastAsiaTheme="minorEastAsia"/>
@@ -7250,7 +7926,7 @@
         </w:rPr>
         <w:t>out</w:t>
       </w:r>
-      <w:ins w:id="52" w:author="Lima, Nathan M. (Fed)" w:date="2026-02-17T12:13:00Z" w16du:dateUtc="2026-02-17T17:13:00Z">
+      <w:ins w:id="74" w:author="Lima, Nathan M. (Fed)" w:date="2026-02-17T12:13:00Z" w16du:dateUtc="2026-02-17T17:13:00Z">
         <w:r>
           <w:rPr>
             <w:rFonts w:eastAsiaTheme="minorEastAsia"/>
@@ -7259,7 +7935,7 @@
           <w:t>side</w:t>
         </w:r>
       </w:ins>
-      <w:ins w:id="53" w:author="Lima, Nathan M. (Fed)" w:date="2026-02-17T12:14:00Z" w16du:dateUtc="2026-02-17T17:14:00Z">
+      <w:ins w:id="75" w:author="Lima, Nathan M. (Fed)" w:date="2026-02-17T12:14:00Z" w16du:dateUtc="2026-02-17T17:14:00Z">
         <w:r>
           <w:rPr>
             <w:rFonts w:eastAsiaTheme="minorEastAsia"/>
@@ -7269,7 +7945,7 @@
         </w:r>
       </w:ins>
       <w:proofErr w:type="spellEnd"/>
-      <w:del w:id="54" w:author="Lima, Nathan M. (Fed)" w:date="2026-02-17T12:12:00Z" w16du:dateUtc="2026-02-17T17:12:00Z">
+      <w:del w:id="76" w:author="Lima, Nathan M. (Fed)" w:date="2026-02-17T12:12:00Z" w16du:dateUtc="2026-02-17T17:12:00Z">
         <w:r>
           <w:rPr>
             <w:rFonts w:eastAsiaTheme="minorEastAsia"/>
@@ -7319,7 +7995,7 @@
         </w:rPr>
         <w:t xml:space="preserve"> (</w:t>
       </w:r>
-      <w:ins w:id="55" w:author="Lima, Nathan M. (Fed)" w:date="2026-02-17T12:14:00Z" w16du:dateUtc="2026-02-17T17:14:00Z">
+      <w:ins w:id="77" w:author="Lima, Nathan M. (Fed)" w:date="2026-02-17T12:14:00Z" w16du:dateUtc="2026-02-17T17:14:00Z">
         <w:r>
           <w:rPr>
             <w:rFonts w:eastAsiaTheme="minorEastAsia"/>
@@ -7328,7 +8004,7 @@
           <w:t>B</w:t>
         </w:r>
       </w:ins>
-      <w:del w:id="56" w:author="Lima, Nathan M. (Fed)" w:date="2026-02-17T12:14:00Z" w16du:dateUtc="2026-02-17T17:14:00Z">
+      <w:del w:id="78" w:author="Lima, Nathan M. (Fed)" w:date="2026-02-17T12:14:00Z" w16du:dateUtc="2026-02-17T17:14:00Z">
         <w:r>
           <w:rPr>
             <w:rFonts w:eastAsiaTheme="minorEastAsia"/>
@@ -7365,7 +8041,7 @@
         <w:t>QuantAQ2 (</w:t>
       </w:r>
       <w:proofErr w:type="spellStart"/>
-      <w:ins w:id="57" w:author="Lima, Nathan M. (Fed)" w:date="2026-02-17T12:15:00Z" w16du:dateUtc="2026-02-17T17:15:00Z">
+      <w:ins w:id="79" w:author="Lima, Nathan M. (Fed)" w:date="2026-02-17T12:15:00Z" w16du:dateUtc="2026-02-17T17:15:00Z">
         <w:r>
           <w:rPr>
             <w:rFonts w:eastAsiaTheme="minorEastAsia"/>
@@ -7374,7 +8050,7 @@
           <w:t>O</w:t>
         </w:r>
       </w:ins>
-      <w:del w:id="58" w:author="Lima, Nathan M. (Fed)" w:date="2026-02-17T12:15:00Z" w16du:dateUtc="2026-02-17T17:15:00Z">
+      <w:del w:id="80" w:author="Lima, Nathan M. (Fed)" w:date="2026-02-17T12:15:00Z" w16du:dateUtc="2026-02-17T17:15:00Z">
         <w:r>
           <w:rPr>
             <w:rFonts w:eastAsiaTheme="minorEastAsia"/>
@@ -7390,7 +8066,7 @@
         </w:rPr>
         <w:t>utside</w:t>
       </w:r>
-      <w:ins w:id="59" w:author="Lima, Nathan M. (Fed)" w:date="2026-02-17T12:15:00Z" w16du:dateUtc="2026-02-17T17:15:00Z">
+      <w:ins w:id="81" w:author="Lima, Nathan M. (Fed)" w:date="2026-02-17T12:15:00Z" w16du:dateUtc="2026-02-17T17:15:00Z">
         <w:r>
           <w:rPr>
             <w:rFonts w:eastAsiaTheme="minorEastAsia"/>
@@ -7427,7 +8103,7 @@
         </w:rPr>
         <w:t>DAQ (</w:t>
       </w:r>
-      <w:ins w:id="60" w:author="Lima, Nathan M. (Fed)" w:date="2026-02-17T12:15:00Z" w16du:dateUtc="2026-02-17T17:15:00Z">
+      <w:ins w:id="82" w:author="Lima, Nathan M. (Fed)" w:date="2026-02-17T12:15:00Z" w16du:dateUtc="2026-02-17T17:15:00Z">
         <w:r>
           <w:rPr>
             <w:rFonts w:eastAsiaTheme="minorEastAsia"/>
@@ -7436,7 +8112,7 @@
           <w:t xml:space="preserve">Vaisala </w:t>
         </w:r>
       </w:ins>
-      <w:del w:id="61" w:author="Lima, Nathan M. (Fed)" w:date="2026-02-17T12:15:00Z" w16du:dateUtc="2026-02-17T17:15:00Z">
+      <w:del w:id="83" w:author="Lima, Nathan M. (Fed)" w:date="2026-02-17T12:15:00Z" w16du:dateUtc="2026-02-17T17:15:00Z">
         <w:r>
           <w:rPr>
             <w:rFonts w:eastAsiaTheme="minorEastAsia"/>
@@ -7445,7 +8121,7 @@
           <w:delText>b</w:delText>
         </w:r>
       </w:del>
-      <w:ins w:id="62" w:author="Lima, Nathan M. (Fed)" w:date="2026-02-17T12:15:00Z" w16du:dateUtc="2026-02-17T17:15:00Z">
+      <w:ins w:id="84" w:author="Lima, Nathan M. (Fed)" w:date="2026-02-17T12:15:00Z" w16du:dateUtc="2026-02-17T17:15:00Z">
         <w:r>
           <w:rPr>
             <w:rFonts w:eastAsiaTheme="minorEastAsia"/>
@@ -7481,7 +8157,7 @@
         </w:rPr>
         <w:t>DAQ (</w:t>
       </w:r>
-      <w:ins w:id="63" w:author="Lima, Nathan M. (Fed)" w:date="2026-02-17T12:15:00Z" w16du:dateUtc="2026-02-17T17:15:00Z">
+      <w:ins w:id="85" w:author="Lima, Nathan M. (Fed)" w:date="2026-02-17T12:15:00Z" w16du:dateUtc="2026-02-17T17:15:00Z">
         <w:r>
           <w:rPr>
             <w:rFonts w:eastAsiaTheme="minorEastAsia"/>
@@ -7490,7 +8166,7 @@
           <w:t>Vaisala B</w:t>
         </w:r>
       </w:ins>
-      <w:del w:id="64" w:author="Lima, Nathan M. (Fed)" w:date="2026-02-17T12:15:00Z" w16du:dateUtc="2026-02-17T17:15:00Z">
+      <w:del w:id="86" w:author="Lima, Nathan M. (Fed)" w:date="2026-02-17T12:15:00Z" w16du:dateUtc="2026-02-17T17:15:00Z">
         <w:r>
           <w:rPr>
             <w:rFonts w:eastAsiaTheme="minorEastAsia"/>
@@ -7526,7 +8202,7 @@
         </w:rPr>
         <w:t>DAQ (</w:t>
       </w:r>
-      <w:ins w:id="65" w:author="Lima, Nathan M. (Fed)" w:date="2026-02-17T12:15:00Z" w16du:dateUtc="2026-02-17T17:15:00Z">
+      <w:ins w:id="87" w:author="Lima, Nathan M. (Fed)" w:date="2026-02-17T12:15:00Z" w16du:dateUtc="2026-02-17T17:15:00Z">
         <w:r>
           <w:rPr>
             <w:rFonts w:eastAsiaTheme="minorEastAsia"/>
@@ -7535,7 +8211,7 @@
           <w:t xml:space="preserve">Vaisala </w:t>
         </w:r>
       </w:ins>
-      <w:del w:id="66" w:author="Lima, Nathan M. (Fed)" w:date="2026-02-17T12:15:00Z" w16du:dateUtc="2026-02-17T17:15:00Z">
+      <w:del w:id="88" w:author="Lima, Nathan M. (Fed)" w:date="2026-02-17T12:15:00Z" w16du:dateUtc="2026-02-17T17:15:00Z">
         <w:r>
           <w:rPr>
             <w:rFonts w:eastAsiaTheme="minorEastAsia"/>
@@ -7551,7 +8227,7 @@
         </w:rPr>
         <w:t>Living</w:t>
       </w:r>
-      <w:ins w:id="67" w:author="Lima, Nathan M. (Fed)" w:date="2026-02-17T12:16:00Z" w16du:dateUtc="2026-02-17T17:16:00Z">
+      <w:ins w:id="89" w:author="Lima, Nathan M. (Fed)" w:date="2026-02-17T12:16:00Z" w16du:dateUtc="2026-02-17T17:16:00Z">
         <w:r>
           <w:rPr>
             <w:rFonts w:eastAsiaTheme="minorEastAsia"/>
@@ -7576,12 +8252,12 @@
           <w:numId w:val="5"/>
         </w:numPr>
         <w:rPr>
-          <w:ins w:id="68" w:author="Lima, Nathan M. (Fed)" w:date="2026-02-17T12:16:00Z" w16du:dateUtc="2026-02-17T17:16:00Z"/>
-          <w:rFonts w:eastAsiaTheme="minorEastAsia"/>
-          <w:color w:val="000000" w:themeColor="text1"/>
-        </w:rPr>
-      </w:pPr>
-      <w:del w:id="69" w:author="Lima, Nathan M. (Fed)" w:date="2026-02-17T12:16:00Z" w16du:dateUtc="2026-02-17T17:16:00Z">
+          <w:ins w:id="90" w:author="Lima, Nathan M. (Fed)" w:date="2026-02-17T12:16:00Z" w16du:dateUtc="2026-02-17T17:16:00Z"/>
+          <w:rFonts w:eastAsiaTheme="minorEastAsia"/>
+          <w:color w:val="000000" w:themeColor="text1"/>
+        </w:rPr>
+      </w:pPr>
+      <w:del w:id="91" w:author="Lima, Nathan M. (Fed)" w:date="2026-02-17T12:16:00Z" w16du:dateUtc="2026-02-17T17:16:00Z">
         <w:r>
           <w:rPr>
             <w:rFonts w:eastAsiaTheme="minorEastAsia"/>
@@ -7590,7 +8266,7 @@
           <w:delText>DAQ (Outside)</w:delText>
         </w:r>
       </w:del>
-      <w:ins w:id="70" w:author="Lima, Nathan M. (Fed)" w:date="2026-02-17T12:18:00Z" w16du:dateUtc="2026-02-17T17:18:00Z">
+      <w:ins w:id="92" w:author="Lima, Nathan M. (Fed)" w:date="2026-02-17T12:18:00Z" w16du:dateUtc="2026-02-17T17:18:00Z">
         <w:r>
           <w:rPr>
             <w:rFonts w:eastAsiaTheme="minorEastAsia"/>
@@ -7606,7 +8282,7 @@
           <w:t xml:space="preserve">D/G </w:t>
         </w:r>
       </w:ins>
-      <w:ins w:id="71" w:author="Lima, Nathan M. (Fed)" w:date="2026-02-17T12:11:00Z" w16du:dateUtc="2026-02-17T17:11:00Z">
+      <w:ins w:id="93" w:author="Lima, Nathan M. (Fed)" w:date="2026-02-17T12:11:00Z" w16du:dateUtc="2026-02-17T17:11:00Z">
         <w:r>
           <w:rPr>
             <w:rFonts w:eastAsiaTheme="minorEastAsia"/>
@@ -7615,7 +8291,7 @@
           <w:t>(</w:t>
         </w:r>
       </w:ins>
-      <w:ins w:id="72" w:author="Lima, Nathan M. (Fed)" w:date="2026-02-17T12:19:00Z" w16du:dateUtc="2026-02-17T17:19:00Z">
+      <w:ins w:id="94" w:author="Lima, Nathan M. (Fed)" w:date="2026-02-17T12:19:00Z" w16du:dateUtc="2026-02-17T17:19:00Z">
         <w:r>
           <w:rPr>
             <w:rFonts w:eastAsiaTheme="minorEastAsia"/>
@@ -7624,7 +8300,7 @@
           <w:t xml:space="preserve">HOBO </w:t>
         </w:r>
       </w:ins>
-      <w:ins w:id="73" w:author="Lima, Nathan M. (Fed)" w:date="2026-02-17T12:12:00Z" w16du:dateUtc="2026-02-17T17:12:00Z">
+      <w:ins w:id="95" w:author="Lima, Nathan M. (Fed)" w:date="2026-02-17T12:12:00Z" w16du:dateUtc="2026-02-17T17:12:00Z">
         <w:r>
           <w:rPr>
             <w:rFonts w:eastAsiaTheme="minorEastAsia"/>
@@ -7633,7 +8309,7 @@
           <w:t>Bathroom1)</w:t>
         </w:r>
       </w:ins>
-      <w:ins w:id="74" w:author="Lima, Nathan M. (Fed)" w:date="2026-02-17T12:20:00Z" w16du:dateUtc="2026-02-17T17:20:00Z">
+      <w:ins w:id="96" w:author="Lima, Nathan M. (Fed)" w:date="2026-02-17T12:20:00Z" w16du:dateUtc="2026-02-17T17:20:00Z">
         <w:r>
           <w:rPr>
             <w:rFonts w:eastAsiaTheme="minorEastAsia"/>
@@ -7651,13 +8327,13 @@
           <w:numId w:val="5"/>
         </w:numPr>
         <w:rPr>
-          <w:ins w:id="75" w:author="Lima, Nathan M. (Fed)" w:date="2026-02-17T12:16:00Z" w16du:dateUtc="2026-02-17T17:16:00Z"/>
+          <w:ins w:id="97" w:author="Lima, Nathan M. (Fed)" w:date="2026-02-17T12:16:00Z" w16du:dateUtc="2026-02-17T17:16:00Z"/>
           <w:rFonts w:eastAsiaTheme="minorEastAsia"/>
           <w:color w:val="000000" w:themeColor="text1"/>
         </w:rPr>
       </w:pPr>
       <w:proofErr w:type="spellStart"/>
-      <w:ins w:id="76" w:author="Lima, Nathan M. (Fed)" w:date="2026-02-17T12:19:00Z" w16du:dateUtc="2026-02-17T17:19:00Z">
+      <w:ins w:id="98" w:author="Lima, Nathan M. (Fed)" w:date="2026-02-17T12:19:00Z" w16du:dateUtc="2026-02-17T17:19:00Z">
         <w:r>
           <w:rPr>
             <w:rFonts w:eastAsiaTheme="minorEastAsia"/>
@@ -7666,7 +8342,7 @@
           <w:t>MB_</w:t>
         </w:r>
       </w:ins>
-      <w:ins w:id="77" w:author="Lima, Nathan M. (Fed)" w:date="2026-02-17T12:18:00Z" w16du:dateUtc="2026-02-17T17:18:00Z">
+      <w:ins w:id="99" w:author="Lima, Nathan M. (Fed)" w:date="2026-02-17T12:18:00Z" w16du:dateUtc="2026-02-17T17:18:00Z">
         <w:r>
           <w:rPr>
             <w:rFonts w:eastAsiaTheme="minorEastAsia"/>
@@ -7683,7 +8359,7 @@
           <w:t xml:space="preserve"> </w:t>
         </w:r>
       </w:ins>
-      <w:ins w:id="78" w:author="Lima, Nathan M. (Fed)" w:date="2026-02-17T12:16:00Z" w16du:dateUtc="2026-02-17T17:16:00Z">
+      <w:ins w:id="100" w:author="Lima, Nathan M. (Fed)" w:date="2026-02-17T12:16:00Z" w16du:dateUtc="2026-02-17T17:16:00Z">
         <w:r>
           <w:rPr>
             <w:rFonts w:eastAsiaTheme="minorEastAsia"/>
@@ -7692,7 +8368,7 @@
           <w:t>(</w:t>
         </w:r>
       </w:ins>
-      <w:ins w:id="79" w:author="Lima, Nathan M. (Fed)" w:date="2026-02-17T12:19:00Z" w16du:dateUtc="2026-02-17T17:19:00Z">
+      <w:ins w:id="101" w:author="Lima, Nathan M. (Fed)" w:date="2026-02-17T12:19:00Z" w16du:dateUtc="2026-02-17T17:19:00Z">
         <w:r>
           <w:rPr>
             <w:rFonts w:eastAsiaTheme="minorEastAsia"/>
@@ -7701,7 +8377,7 @@
           <w:t xml:space="preserve">HOBO </w:t>
         </w:r>
       </w:ins>
-      <w:ins w:id="80" w:author="Lima, Nathan M. (Fed)" w:date="2026-02-17T12:16:00Z" w16du:dateUtc="2026-02-17T17:16:00Z">
+      <w:ins w:id="102" w:author="Lima, Nathan M. (Fed)" w:date="2026-02-17T12:16:00Z" w16du:dateUtc="2026-02-17T17:16:00Z">
         <w:r>
           <w:rPr>
             <w:rFonts w:eastAsiaTheme="minorEastAsia"/>
@@ -7719,12 +8395,12 @@
           <w:numId w:val="5"/>
         </w:numPr>
         <w:rPr>
-          <w:ins w:id="81" w:author="Lima, Nathan M. (Fed)" w:date="2026-02-17T12:16:00Z" w16du:dateUtc="2026-02-17T17:16:00Z"/>
-          <w:rFonts w:eastAsiaTheme="minorEastAsia"/>
-          <w:color w:val="000000" w:themeColor="text1"/>
-        </w:rPr>
-      </w:pPr>
-      <w:ins w:id="82" w:author="Lima, Nathan M. (Fed)" w:date="2026-02-17T12:19:00Z" w16du:dateUtc="2026-02-17T17:19:00Z">
+          <w:ins w:id="103" w:author="Lima, Nathan M. (Fed)" w:date="2026-02-17T12:16:00Z" w16du:dateUtc="2026-02-17T17:16:00Z"/>
+          <w:rFonts w:eastAsiaTheme="minorEastAsia"/>
+          <w:color w:val="000000" w:themeColor="text1"/>
+        </w:rPr>
+      </w:pPr>
+      <w:ins w:id="104" w:author="Lima, Nathan M. (Fed)" w:date="2026-02-17T12:19:00Z" w16du:dateUtc="2026-02-17T17:19:00Z">
         <w:r>
           <w:rPr>
             <w:rFonts w:eastAsiaTheme="minorEastAsia"/>
@@ -7733,7 +8409,7 @@
           <w:t>MB_</w:t>
         </w:r>
       </w:ins>
-      <w:ins w:id="83" w:author="Lima, Nathan M. (Fed)" w:date="2026-02-17T12:18:00Z" w16du:dateUtc="2026-02-17T17:18:00Z">
+      <w:ins w:id="105" w:author="Lima, Nathan M. (Fed)" w:date="2026-02-17T12:18:00Z" w16du:dateUtc="2026-02-17T17:18:00Z">
         <w:r>
           <w:rPr>
             <w:rFonts w:eastAsiaTheme="minorEastAsia"/>
@@ -7742,7 +8418,7 @@
           <w:t xml:space="preserve">E </w:t>
         </w:r>
       </w:ins>
-      <w:ins w:id="84" w:author="Lima, Nathan M. (Fed)" w:date="2026-02-17T12:16:00Z" w16du:dateUtc="2026-02-17T17:16:00Z">
+      <w:ins w:id="106" w:author="Lima, Nathan M. (Fed)" w:date="2026-02-17T12:16:00Z" w16du:dateUtc="2026-02-17T17:16:00Z">
         <w:r>
           <w:rPr>
             <w:rFonts w:eastAsiaTheme="minorEastAsia"/>
@@ -7751,7 +8427,7 @@
           <w:t>(</w:t>
         </w:r>
       </w:ins>
-      <w:ins w:id="85" w:author="Lima, Nathan M. (Fed)" w:date="2026-02-17T12:19:00Z" w16du:dateUtc="2026-02-17T17:19:00Z">
+      <w:ins w:id="107" w:author="Lima, Nathan M. (Fed)" w:date="2026-02-17T12:19:00Z" w16du:dateUtc="2026-02-17T17:19:00Z">
         <w:r>
           <w:rPr>
             <w:rFonts w:eastAsiaTheme="minorEastAsia"/>
@@ -7760,7 +8436,7 @@
           <w:t xml:space="preserve">HOBO </w:t>
         </w:r>
       </w:ins>
-      <w:ins w:id="86" w:author="Lima, Nathan M. (Fed)" w:date="2026-02-17T12:16:00Z" w16du:dateUtc="2026-02-17T17:16:00Z">
+      <w:ins w:id="108" w:author="Lima, Nathan M. (Fed)" w:date="2026-02-17T12:16:00Z" w16du:dateUtc="2026-02-17T17:16:00Z">
         <w:r>
           <w:rPr>
             <w:rFonts w:eastAsiaTheme="minorEastAsia"/>
@@ -7778,13 +8454,13 @@
           <w:numId w:val="5"/>
         </w:numPr>
         <w:rPr>
-          <w:ins w:id="87" w:author="Lima, Nathan M. (Fed)" w:date="2026-02-17T12:17:00Z" w16du:dateUtc="2026-02-17T17:17:00Z"/>
+          <w:ins w:id="109" w:author="Lima, Nathan M. (Fed)" w:date="2026-02-17T12:17:00Z" w16du:dateUtc="2026-02-17T17:17:00Z"/>
           <w:rFonts w:eastAsiaTheme="minorEastAsia"/>
           <w:color w:val="000000" w:themeColor="text1"/>
         </w:rPr>
       </w:pPr>
       <w:proofErr w:type="spellStart"/>
-      <w:ins w:id="88" w:author="Lima, Nathan M. (Fed)" w:date="2026-02-17T12:19:00Z" w16du:dateUtc="2026-02-17T17:19:00Z">
+      <w:ins w:id="110" w:author="Lima, Nathan M. (Fed)" w:date="2026-02-17T12:19:00Z" w16du:dateUtc="2026-02-17T17:19:00Z">
         <w:r>
           <w:rPr>
             <w:rFonts w:eastAsiaTheme="minorEastAsia"/>
@@ -7801,7 +8477,7 @@
           <w:t xml:space="preserve"> </w:t>
         </w:r>
       </w:ins>
-      <w:ins w:id="89" w:author="Lima, Nathan M. (Fed)" w:date="2026-02-17T12:16:00Z" w16du:dateUtc="2026-02-17T17:16:00Z">
+      <w:ins w:id="111" w:author="Lima, Nathan M. (Fed)" w:date="2026-02-17T12:16:00Z" w16du:dateUtc="2026-02-17T17:16:00Z">
         <w:r>
           <w:rPr>
             <w:rFonts w:eastAsiaTheme="minorEastAsia"/>
@@ -7810,7 +8486,7 @@
           <w:t>(</w:t>
         </w:r>
       </w:ins>
-      <w:ins w:id="90" w:author="Lima, Nathan M. (Fed)" w:date="2026-02-17T12:19:00Z" w16du:dateUtc="2026-02-17T17:19:00Z">
+      <w:ins w:id="112" w:author="Lima, Nathan M. (Fed)" w:date="2026-02-17T12:19:00Z" w16du:dateUtc="2026-02-17T17:19:00Z">
         <w:r>
           <w:rPr>
             <w:rFonts w:eastAsiaTheme="minorEastAsia"/>
@@ -7819,7 +8495,7 @@
           <w:t xml:space="preserve">HOBO </w:t>
         </w:r>
       </w:ins>
-      <w:ins w:id="91" w:author="Lima, Nathan M. (Fed)" w:date="2026-02-17T12:16:00Z" w16du:dateUtc="2026-02-17T17:16:00Z">
+      <w:ins w:id="113" w:author="Lima, Nathan M. (Fed)" w:date="2026-02-17T12:16:00Z" w16du:dateUtc="2026-02-17T17:16:00Z">
         <w:r>
           <w:rPr>
             <w:rFonts w:eastAsiaTheme="minorEastAsia"/>
@@ -7828,7 +8504,7 @@
           <w:t>B</w:t>
         </w:r>
       </w:ins>
-      <w:ins w:id="92" w:author="Lima, Nathan M. (Fed)" w:date="2026-02-17T12:17:00Z" w16du:dateUtc="2026-02-17T17:17:00Z">
+      <w:ins w:id="114" w:author="Lima, Nathan M. (Fed)" w:date="2026-02-17T12:17:00Z" w16du:dateUtc="2026-02-17T17:17:00Z">
         <w:r>
           <w:rPr>
             <w:rFonts w:eastAsiaTheme="minorEastAsia"/>
@@ -7837,7 +8513,7 @@
           <w:t>ed</w:t>
         </w:r>
       </w:ins>
-      <w:ins w:id="93" w:author="Lima, Nathan M. (Fed)" w:date="2026-02-17T12:16:00Z" w16du:dateUtc="2026-02-17T17:16:00Z">
+      <w:ins w:id="115" w:author="Lima, Nathan M. (Fed)" w:date="2026-02-17T12:16:00Z" w16du:dateUtc="2026-02-17T17:16:00Z">
         <w:r>
           <w:rPr>
             <w:rFonts w:eastAsiaTheme="minorEastAsia"/>
@@ -7855,12 +8531,12 @@
           <w:numId w:val="5"/>
         </w:numPr>
         <w:rPr>
-          <w:ins w:id="94" w:author="Lima, Nathan M. (Fed)" w:date="2026-02-17T12:17:00Z" w16du:dateUtc="2026-02-17T17:17:00Z"/>
-          <w:rFonts w:eastAsiaTheme="minorEastAsia"/>
-          <w:color w:val="000000" w:themeColor="text1"/>
-        </w:rPr>
-      </w:pPr>
-      <w:ins w:id="95" w:author="Lima, Nathan M. (Fed)" w:date="2026-02-17T12:19:00Z" w16du:dateUtc="2026-02-17T17:19:00Z">
+          <w:ins w:id="116" w:author="Lima, Nathan M. (Fed)" w:date="2026-02-17T12:17:00Z" w16du:dateUtc="2026-02-17T17:17:00Z"/>
+          <w:rFonts w:eastAsiaTheme="minorEastAsia"/>
+          <w:color w:val="000000" w:themeColor="text1"/>
+        </w:rPr>
+      </w:pPr>
+      <w:ins w:id="117" w:author="Lima, Nathan M. (Fed)" w:date="2026-02-17T12:19:00Z" w16du:dateUtc="2026-02-17T17:19:00Z">
         <w:r>
           <w:rPr>
             <w:rFonts w:eastAsiaTheme="minorEastAsia"/>
@@ -7869,7 +8545,7 @@
           <w:t xml:space="preserve">MB_F </w:t>
         </w:r>
       </w:ins>
-      <w:ins w:id="96" w:author="Lima, Nathan M. (Fed)" w:date="2026-02-17T12:17:00Z" w16du:dateUtc="2026-02-17T17:17:00Z">
+      <w:ins w:id="118" w:author="Lima, Nathan M. (Fed)" w:date="2026-02-17T12:17:00Z" w16du:dateUtc="2026-02-17T17:17:00Z">
         <w:r>
           <w:rPr>
             <w:rFonts w:eastAsiaTheme="minorEastAsia"/>
@@ -7878,7 +8554,7 @@
           <w:t>(</w:t>
         </w:r>
       </w:ins>
-      <w:ins w:id="97" w:author="Lima, Nathan M. (Fed)" w:date="2026-02-17T12:20:00Z" w16du:dateUtc="2026-02-17T17:20:00Z">
+      <w:ins w:id="119" w:author="Lima, Nathan M. (Fed)" w:date="2026-02-17T12:20:00Z" w16du:dateUtc="2026-02-17T17:20:00Z">
         <w:r>
           <w:rPr>
             <w:rFonts w:eastAsiaTheme="minorEastAsia"/>
@@ -7887,7 +8563,7 @@
           <w:t xml:space="preserve">HOBO </w:t>
         </w:r>
       </w:ins>
-      <w:ins w:id="98" w:author="Lima, Nathan M. (Fed)" w:date="2026-02-17T12:17:00Z" w16du:dateUtc="2026-02-17T17:17:00Z">
+      <w:ins w:id="120" w:author="Lima, Nathan M. (Fed)" w:date="2026-02-17T12:17:00Z" w16du:dateUtc="2026-02-17T17:17:00Z">
         <w:r>
           <w:rPr>
             <w:rFonts w:eastAsiaTheme="minorEastAsia"/>
@@ -7907,12 +8583,12 @@
         <w:rPr>
           <w:rFonts w:eastAsiaTheme="minorEastAsia"/>
           <w:color w:val="000000" w:themeColor="text1"/>
-          <w:rPrChange w:id="99" w:author="Lima, Nathan M. (Fed)" w:date="2026-02-17T12:17:00Z" w16du:dateUtc="2026-02-17T17:17:00Z">
+          <w:rPrChange w:id="121" w:author="Lima, Nathan M. (Fed)" w:date="2026-02-17T12:17:00Z" w16du:dateUtc="2026-02-17T17:17:00Z">
             <w:rPr/>
           </w:rPrChange>
         </w:rPr>
       </w:pPr>
-      <w:ins w:id="100" w:author="Lima, Nathan M. (Fed)" w:date="2026-02-17T12:19:00Z" w16du:dateUtc="2026-02-17T17:19:00Z">
+      <w:ins w:id="122" w:author="Lima, Nathan M. (Fed)" w:date="2026-02-17T12:19:00Z" w16du:dateUtc="2026-02-17T17:19:00Z">
         <w:r>
           <w:rPr>
             <w:rFonts w:eastAsiaTheme="minorEastAsia"/>
@@ -7921,7 +8597,7 @@
           <w:t xml:space="preserve">MB_C </w:t>
         </w:r>
       </w:ins>
-      <w:ins w:id="101" w:author="Lima, Nathan M. (Fed)" w:date="2026-02-17T12:17:00Z" w16du:dateUtc="2026-02-17T17:17:00Z">
+      <w:ins w:id="123" w:author="Lima, Nathan M. (Fed)" w:date="2026-02-17T12:17:00Z" w16du:dateUtc="2026-02-17T17:17:00Z">
         <w:r>
           <w:rPr>
             <w:rFonts w:eastAsiaTheme="minorEastAsia"/>
@@ -7930,7 +8606,7 @@
           <w:t>(</w:t>
         </w:r>
       </w:ins>
-      <w:ins w:id="102" w:author="Lima, Nathan M. (Fed)" w:date="2026-02-17T12:20:00Z" w16du:dateUtc="2026-02-17T17:20:00Z">
+      <w:ins w:id="124" w:author="Lima, Nathan M. (Fed)" w:date="2026-02-17T12:20:00Z" w16du:dateUtc="2026-02-17T17:20:00Z">
         <w:r>
           <w:rPr>
             <w:rFonts w:eastAsiaTheme="minorEastAsia"/>
@@ -7939,7 +8615,7 @@
           <w:t xml:space="preserve">HOBO </w:t>
         </w:r>
       </w:ins>
-      <w:ins w:id="103" w:author="Lima, Nathan M. (Fed)" w:date="2026-02-17T12:17:00Z" w16du:dateUtc="2026-02-17T17:17:00Z">
+      <w:ins w:id="125" w:author="Lima, Nathan M. (Fed)" w:date="2026-02-17T12:17:00Z" w16du:dateUtc="2026-02-17T17:17:00Z">
         <w:r>
           <w:rPr>
             <w:rFonts w:eastAsiaTheme="minorEastAsia"/>
@@ -7988,7 +8664,37 @@
           <w:rFonts w:eastAsiaTheme="minorEastAsia"/>
           <w:color w:val="000000" w:themeColor="text1"/>
         </w:rPr>
-        <w:t xml:space="preserve">The initial average and standard deviation of RH, for the 30 </w:t>
+        <w:t xml:space="preserve">The </w:t>
+      </w:r>
+      <w:proofErr w:type="gramStart"/>
+      <w:r>
+        <w:rPr>
+          <w:rFonts w:eastAsiaTheme="minorEastAsia"/>
+          <w:color w:val="000000" w:themeColor="text1"/>
+        </w:rPr>
+        <w:t>initial</w:t>
+      </w:r>
+      <w:proofErr w:type="gramEnd"/>
+      <w:r>
+        <w:rPr>
+          <w:rFonts w:eastAsiaTheme="minorEastAsia"/>
+          <w:color w:val="000000" w:themeColor="text1"/>
+        </w:rPr>
+        <w:t xml:space="preserve"> average and standard deviation of RH for </w:t>
+      </w:r>
+      <w:r>
+        <w:rPr>
+          <w:rFonts w:eastAsiaTheme="minorEastAsia"/>
+          <w:color w:val="000000" w:themeColor="text1"/>
+        </w:rPr>
+        <w:t>30</w:t>
+      </w:r>
+      <w:r>
+        <w:rPr>
+          <w:rFonts w:eastAsiaTheme="minorEastAsia"/>
+          <w:color w:val="000000" w:themeColor="text1"/>
+        </w:rPr>
+        <w:t xml:space="preserve"> </w:t>
       </w:r>
       <w:r>
         <w:rPr>
@@ -8044,54 +8750,29 @@
           <w:rFonts w:eastAsiaTheme="minorEastAsia"/>
           <w:color w:val="000000" w:themeColor="text1"/>
         </w:rPr>
-        <w:t xml:space="preserve"> RH for the </w:t>
-      </w:r>
-      <w:r>
-        <w:rPr>
-          <w:rFonts w:eastAsiaTheme="minorEastAsia"/>
-          <w:color w:val="000000" w:themeColor="text1"/>
-        </w:rPr>
-        <w:t>two-hour</w:t>
-      </w:r>
-      <w:r>
-        <w:rPr>
-          <w:rFonts w:eastAsiaTheme="minorEastAsia"/>
-          <w:color w:val="000000" w:themeColor="text1"/>
-        </w:rPr>
-        <w:t xml:space="preserve"> period</w:t>
-      </w:r>
-      <w:r>
-        <w:rPr>
-          <w:rFonts w:eastAsiaTheme="minorEastAsia"/>
-          <w:color w:val="000000" w:themeColor="text1"/>
-        </w:rPr>
-        <w:t xml:space="preserve"> after the shower turns off, along with the difference between the </w:t>
-      </w:r>
-      <w:proofErr w:type="gramStart"/>
-      <w:r>
-        <w:rPr>
-          <w:rFonts w:eastAsiaTheme="minorEastAsia"/>
-          <w:color w:val="000000" w:themeColor="text1"/>
-        </w:rPr>
-        <w:t>min</w:t>
-      </w:r>
-      <w:proofErr w:type="gramEnd"/>
-      <w:r>
-        <w:rPr>
-          <w:rFonts w:eastAsiaTheme="minorEastAsia"/>
-          <w:color w:val="000000" w:themeColor="text1"/>
-        </w:rPr>
-        <w:t xml:space="preserve"> and max values for that </w:t>
-      </w:r>
-      <w:proofErr w:type="gramStart"/>
-      <w:r>
-        <w:rPr>
-          <w:rFonts w:eastAsiaTheme="minorEastAsia"/>
-          <w:color w:val="000000" w:themeColor="text1"/>
-        </w:rPr>
-        <w:t>time period</w:t>
-      </w:r>
-      <w:proofErr w:type="gramEnd"/>
+        <w:t xml:space="preserve"> RH for </w:t>
+      </w:r>
+      <w:r>
+        <w:rPr>
+          <w:rFonts w:eastAsiaTheme="minorEastAsia"/>
+          <w:color w:val="000000" w:themeColor="text1"/>
+        </w:rPr>
+        <w:t>the two hours</w:t>
+      </w:r>
+      <w:r>
+        <w:rPr>
+          <w:rFonts w:eastAsiaTheme="minorEastAsia"/>
+          <w:color w:val="000000" w:themeColor="text1"/>
+        </w:rPr>
+        <w:t xml:space="preserve"> after the shower turns off, along with the difference between the min and max values for that </w:t>
+      </w:r>
+      <w:r>
+        <w:rPr>
+          <w:rFonts w:eastAsiaTheme="minorEastAsia"/>
+          <w:color w:val="000000" w:themeColor="text1"/>
+        </w:rPr>
+        <w:t>period</w:t>
+      </w:r>
       <w:r>
         <w:rPr>
           <w:rFonts w:eastAsiaTheme="minorEastAsia"/>
@@ -8234,15 +8915,13 @@
         </w:rPr>
         <w:t xml:space="preserve"> report the average temperature for the two hours after the shower turns off, along with the difference between the min and max values for that </w:t>
       </w:r>
-      <w:proofErr w:type="gramStart"/>
-      <w:r>
-        <w:rPr>
-          <w:rFonts w:eastAsiaTheme="minorEastAsia"/>
-          <w:color w:val="000000" w:themeColor="text1"/>
-        </w:rPr>
-        <w:t>time period</w:t>
-      </w:r>
-      <w:proofErr w:type="gramEnd"/>
+      <w:r>
+        <w:rPr>
+          <w:rFonts w:eastAsiaTheme="minorEastAsia"/>
+          <w:color w:val="000000" w:themeColor="text1"/>
+        </w:rPr>
+        <w:t>period</w:t>
+      </w:r>
       <w:r>
         <w:rPr>
           <w:rFonts w:eastAsiaTheme="minorEastAsia"/>
@@ -8345,37 +9024,21 @@
           <w:rFonts w:eastAsiaTheme="minorEastAsia"/>
           <w:color w:val="000000" w:themeColor="text1"/>
         </w:rPr>
-        <w:t>temperatures for the two-hour</w:t>
-      </w:r>
-      <w:r>
-        <w:rPr>
-          <w:rFonts w:eastAsiaTheme="minorEastAsia"/>
-          <w:color w:val="000000" w:themeColor="text1"/>
-        </w:rPr>
-        <w:t xml:space="preserve"> period</w:t>
-      </w:r>
-      <w:r>
-        <w:rPr>
-          <w:rFonts w:eastAsiaTheme="minorEastAsia"/>
-          <w:color w:val="000000" w:themeColor="text1"/>
-        </w:rPr>
-        <w:t xml:space="preserve"> after the shower </w:t>
-      </w:r>
-      <w:proofErr w:type="gramStart"/>
-      <w:r>
-        <w:rPr>
-          <w:rFonts w:eastAsiaTheme="minorEastAsia"/>
-          <w:color w:val="000000" w:themeColor="text1"/>
-        </w:rPr>
-        <w:t>turns</w:t>
-      </w:r>
-      <w:proofErr w:type="gramEnd"/>
-      <w:r>
-        <w:rPr>
-          <w:rFonts w:eastAsiaTheme="minorEastAsia"/>
-          <w:color w:val="000000" w:themeColor="text1"/>
-        </w:rPr>
-        <w:t xml:space="preserve"> off.  </w:t>
+        <w:t xml:space="preserve">temperatures for </w:t>
+      </w:r>
+      <w:r>
+        <w:rPr>
+          <w:rFonts w:eastAsiaTheme="minorEastAsia"/>
+          <w:color w:val="000000" w:themeColor="text1"/>
+        </w:rPr>
+        <w:t>the two hours</w:t>
+      </w:r>
+      <w:r>
+        <w:rPr>
+          <w:rFonts w:eastAsiaTheme="minorEastAsia"/>
+          <w:color w:val="000000" w:themeColor="text1"/>
+        </w:rPr>
+        <w:t xml:space="preserve"> after the shower turns off.</w:t>
       </w:r>
     </w:p>
     <w:p>
@@ -8447,21 +9110,46 @@
           <w:rFonts w:eastAsiaTheme="minorEastAsia"/>
           <w:color w:val="000000" w:themeColor="text1"/>
         </w:rPr>
-        <w:t xml:space="preserve">The initial average and standard deviation of the variables for the </w:t>
-      </w:r>
-      <w:r>
-        <w:rPr>
-          <w:rFonts w:eastAsiaTheme="minorEastAsia"/>
-          <w:color w:val="000000" w:themeColor="text1"/>
-        </w:rPr>
-        <w:t>two-hour</w:t>
-      </w:r>
-      <w:r>
-        <w:rPr>
-          <w:rFonts w:eastAsiaTheme="minorEastAsia"/>
-          <w:color w:val="000000" w:themeColor="text1"/>
-        </w:rPr>
-        <w:t xml:space="preserve"> period after the shower turns off.</w:t>
+        <w:t xml:space="preserve">The </w:t>
+      </w:r>
+      <w:proofErr w:type="gramStart"/>
+      <w:r>
+        <w:rPr>
+          <w:rFonts w:eastAsiaTheme="minorEastAsia"/>
+          <w:color w:val="000000" w:themeColor="text1"/>
+        </w:rPr>
+        <w:t>initial</w:t>
+      </w:r>
+      <w:proofErr w:type="gramEnd"/>
+      <w:r>
+        <w:rPr>
+          <w:rFonts w:eastAsiaTheme="minorEastAsia"/>
+          <w:color w:val="000000" w:themeColor="text1"/>
+        </w:rPr>
+        <w:t xml:space="preserve"> average and standard deviation of the variables for </w:t>
+      </w:r>
+      <w:proofErr w:type="gramStart"/>
+      <w:r>
+        <w:rPr>
+          <w:rFonts w:eastAsiaTheme="minorEastAsia"/>
+          <w:color w:val="000000" w:themeColor="text1"/>
+        </w:rPr>
+        <w:t>the two</w:t>
+      </w:r>
+      <w:proofErr w:type="gramEnd"/>
+      <w:r>
+        <w:rPr>
+          <w:rFonts w:eastAsiaTheme="minorEastAsia"/>
+          <w:color w:val="000000" w:themeColor="text1"/>
+        </w:rPr>
+        <w:t xml:space="preserve"> hours</w:t>
+      </w:r>
+      <w:r>
+        <w:rPr>
+          <w:rFonts w:eastAsiaTheme="minorEastAsia"/>
+          <w:color w:val="000000" w:themeColor="text1"/>
+        </w:rPr>
+        <w:t xml:space="preserve"> after the shower turns off.</w:t>
       </w:r>
     </w:p>
     <w:p/>
@@ -9996,6 +10684,7 @@
   <w:style w:type="character" w:default="1" w:styleId="DefaultParagraphFont">
     <w:name w:val="Default Paragraph Font"/>
     <w:uiPriority w:val="1"/>
+    <w:semiHidden/>
     <w:unhideWhenUsed/>
   </w:style>
   <w:style w:type="table" w:default="1" w:styleId="TableNormal">

</xml_diff>